<commit_message>
HEALTH scenario data kit: Lakeshore Health Partners (LHP)
- 11-table lhp_clinical schema (Minnesota clinic network): patients,
  providers/NPI, appointments, encounters with ICD-10 + notes, LOINC
  labs, NDC/DEA prescriptions, CPT claims, payers, HIPAA disclosure log
- Planted defects: patient SSNs inside two free-text clinical notes,
  a MARKETING disclosure without signed authorization (entry 30005),
  3 opted-out patients with live emails; all counts machine-verified
  along with FK and encounter/claim consistency
- lhp-documents bucket set (18 files): HIPAA risk analysis, disclosure
  audit, coding audit, NPP, correspondence (records request, appeal,
  referral, opt-out), intake forms, lab/837 interface JSON, CPT fee
  schedule, patient statements - all interlocking with the database
- Domain pack (healthcare.example.json + healthcare.people.json + zip),
  LHP cast across all seven PDC v11 roles, scenario.json, bulk-loader CSV

Co-Authored-By: Claude Fable 5 <noreply@anthropic.com>
</commit_message>
<xml_diff>
--- a/courseware/CSCU/Workshop-00-Preflight/Workshop-00-Guide.docx
+++ b/courseware/CSCU/Workshop-00-Preflight/Workshop-00-Guide.docx
@@ -1,6 +1,6 @@
 
 <file path=word/document.xml><?xml version="1.0" encoding="utf-8"?>
-<w:document xmlns:w="http://schemas.openxmlformats.org/wordprocessingml/2006/main" xmlns:r="http://schemas.openxmlformats.org/officeDocument/2006/relationships">
+<w:document xmlns:wpc="http://schemas.microsoft.com/office/word/2010/wordprocessingCanvas" xmlns:cx="http://schemas.microsoft.com/office/drawing/2014/chartex" xmlns:cx1="http://schemas.microsoft.com/office/drawing/2015/9/8/chartex" xmlns:cx2="http://schemas.microsoft.com/office/drawing/2015/10/21/chartex" xmlns:cx3="http://schemas.microsoft.com/office/drawing/2016/5/9/chartex" xmlns:cx4="http://schemas.microsoft.com/office/drawing/2016/5/10/chartex" xmlns:cx5="http://schemas.microsoft.com/office/drawing/2016/5/11/chartex" xmlns:cx6="http://schemas.microsoft.com/office/drawing/2016/5/12/chartex" xmlns:cx7="http://schemas.microsoft.com/office/drawing/2016/5/13/chartex" xmlns:cx8="http://schemas.microsoft.com/office/drawing/2016/5/14/chartex" xmlns:mc="http://schemas.openxmlformats.org/markup-compatibility/2006" xmlns:aink="http://schemas.microsoft.com/office/drawing/2016/ink" xmlns:am3d="http://schemas.microsoft.com/office/drawing/2017/model3d" xmlns:o="urn:schemas-microsoft-com:office:office" xmlns:oel="http://schemas.microsoft.com/office/2019/extlst" xmlns:r="http://schemas.openxmlformats.org/officeDocument/2006/relationships" xmlns:m="http://schemas.openxmlformats.org/officeDocument/2006/math" xmlns:v="urn:schemas-microsoft-com:vml" xmlns:wp14="http://schemas.microsoft.com/office/word/2010/wordprocessingDrawing" xmlns:wp="http://schemas.openxmlformats.org/drawingml/2006/wordprocessingDrawing" xmlns:w10="urn:schemas-microsoft-com:office:word" xmlns:w="http://schemas.openxmlformats.org/wordprocessingml/2006/main" xmlns:w14="http://schemas.microsoft.com/office/word/2010/wordml" xmlns:w15="http://schemas.microsoft.com/office/word/2012/wordml" xmlns:w16cex="http://schemas.microsoft.com/office/word/2018/wordml/cex" xmlns:w16cid="http://schemas.microsoft.com/office/word/2016/wordml/cid" xmlns:w16="http://schemas.microsoft.com/office/word/2018/wordml" xmlns:w16du="http://schemas.microsoft.com/office/word/2023/wordml/word16du" xmlns:w16sdtdh="http://schemas.microsoft.com/office/word/2020/wordml/sdtdatahash" xmlns:w16sdtfl="http://schemas.microsoft.com/office/word/2024/wordml/sdtformatlock" xmlns:w16se="http://schemas.microsoft.com/office/word/2015/wordml/symex" xmlns:wpg="http://schemas.microsoft.com/office/word/2010/wordprocessingGroup" xmlns:wpi="http://schemas.microsoft.com/office/word/2010/wordprocessingInk" xmlns:wne="http://schemas.microsoft.com/office/word/2006/wordml" xmlns:wps="http://schemas.microsoft.com/office/word/2010/wordprocessingShape" mc:Ignorable="w14 w15 w16se w16cid w16 w16cex w16sdtdh w16sdtfl w16du wp14">
   <w:body>
     <w:p>
       <w:pPr>
@@ -13,7 +13,7 @@
           <w:color w:val="1C7293"/>
           <w:spacing w:val="30"/>
         </w:rPr>
-        <w:t xml:space="preserve">PENTAHO DATA CATALOG 11.0.0  ·  BUSINESS ANALYST</w:t>
+        <w:t>PENTAHO DATA CATALOG 11.0.0  ·  BUSINESS ANALYST</w:t>
       </w:r>
     </w:p>
     <w:p>
@@ -27,7 +27,7 @@
           <w:color w:val="5B7886"/>
           <w:spacing w:val="30"/>
         </w:rPr>
-        <w:t xml:space="preserve">PDC PROCESS  ·  USERS &amp; ROLES</w:t>
+        <w:t>PDC PROCESS  ·  USERS &amp; ROLES</w:t>
       </w:r>
     </w:p>
     <w:p>
@@ -43,7 +43,7 @@
           <w:sz w:val="32"/>
           <w:szCs w:val="32"/>
         </w:rPr>
-        <w:t xml:space="preserve">WORKSHOP 0</w:t>
+        <w:t>WORKSHOP 0</w:t>
       </w:r>
     </w:p>
     <w:p>
@@ -59,7 +59,7 @@
           <w:sz w:val="56"/>
           <w:szCs w:val="56"/>
         </w:rPr>
-        <w:t xml:space="preserve">Preflight: Provision Users &amp; Roles</w:t>
+        <w:t>Preflight: Provision Users &amp; Roles</w:t>
       </w:r>
     </w:p>
     <w:p>
@@ -72,7 +72,7 @@
           <w:sz w:val="28"/>
           <w:szCs w:val="28"/>
         </w:rPr>
-        <w:t xml:space="preserve">Build the CSCU cast — nine users across all seven PDC roles — so every later action lands on a named, least-privilege account.</w:t>
+        <w:t>Build the CSCU cast — nine users across all seven PDC roles — so every later action lands on a named, least-privilege account.</w:t>
       </w:r>
     </w:p>
     <w:p>
@@ -103,7 +103,7 @@
           <w:sz w:val="24"/>
           <w:szCs w:val="24"/>
         </w:rPr>
-        <w:t xml:space="preserve">IT Administrator / Catalog Admin</w:t>
+        <w:t>IT Administrator / Catalog Admin</w:t>
       </w:r>
     </w:p>
     <w:p>
@@ -126,7 +126,7 @@
           <w:sz w:val="24"/>
           <w:szCs w:val="24"/>
         </w:rPr>
-        <w:t xml:space="preserve">20 minutes</w:t>
+        <w:t>20 minutes</w:t>
       </w:r>
     </w:p>
     <w:p>
@@ -149,7 +149,7 @@
           <w:sz w:val="24"/>
           <w:szCs w:val="24"/>
         </w:rPr>
-        <w:t xml:space="preserve">Copper State Credit Union (users.csv)</w:t>
+        <w:t>Copper State Credit Union (users.csv)</w:t>
       </w:r>
     </w:p>
     <w:p>
@@ -157,7 +157,7 @@
         <w:pStyle w:val="Heading1"/>
       </w:pPr>
       <w:r>
-        <w:t xml:space="preserve">Why this workshop matters</w:t>
+        <w:t>Why this workshop matters</w:t>
       </w:r>
     </w:p>
     <w:p>
@@ -165,7 +165,7 @@
         <w:spacing w:after="120"/>
       </w:pPr>
       <w:r>
-        <w:t xml:space="preserve">Every governance journey begins with people, not data. Before Pentaho Data Catalog (PDC) can connect a source, profile a table, or govern a business term, the Copper State Credit Union (CSCU) team needs accounts — and each account needs exactly the access its owner's job requires, and no more. Workshop 0 is that groundwork. It runs once, before Workshop 1, and everything the cohort does afterward assumes the users and roles you create here.</w:t>
+        <w:t>Every governance journey begins with people, not data. Before Pentaho Data Catalog (PDC) can connect a source, profile a table, or govern a business term, the Copper State Credit Union (CSCU) team needs accounts — and each account needs exactly the access its owner's job requires, and no more. Workshop 0 is that groundwork. It runs once, before Workshop 1, and everything the cohort does afterward assumes the users and roles you create here.</w:t>
       </w:r>
     </w:p>
     <w:p>
@@ -180,7 +180,7 @@
           <w:i/>
           <w:iCs/>
         </w:rPr>
-        <w:t xml:space="preserve">who can change what</w:t>
+        <w:t>who can change what</w:t>
       </w:r>
       <w:r>
         <w:t xml:space="preserve"> is as important as the data itself. A business steward who curates the glossary should not be able to rewrite a data source; an analyst who reads metadata should not be able to administer the system. PDC expresses these boundaries through role-based access control, and this workshop maps each CSCU person to the role that matches their responsibility.</w:t>
@@ -192,15 +192,15 @@
           <w:left w:val="single" w:sz="12" w:space="8" w:color="065A82"/>
         </w:pBdr>
         <w:shd w:val="clear" w:color="auto" w:fill="EEF6FA"/>
+        <w:spacing w:before="120" w:after="160"/>
         <w:ind w:left="240" w:right="240"/>
-        <w:spacing w:before="120" w:after="160"/>
       </w:pPr>
       <w:r>
         <w:rPr>
           <w:b/>
           <w:bCs/>
         </w:rPr>
-        <w:t xml:space="preserve">The business problem.</w:t>
+        <w:t>The business problem.</w:t>
       </w:r>
       <w:r>
         <w:t xml:space="preserve"> Hand every trainee the same all-powerful login and two things go wrong: nobody can tell, from the catalog, who is responsible for what — and a single mistake can change data an examiner expects to be controlled. When the NCUA asks </w:t>
@@ -210,18 +210,24 @@
           <w:i/>
           <w:iCs/>
         </w:rPr>
-        <w:t xml:space="preserve">"who decided `cvv_cd` is HIGH sensitivity, and when?"</w:t>
-      </w:r>
-      <w:r>
-        <w:t xml:space="preserve">, the answer must be a named steward with the right role. Provisioning distinct, least-privilege accounts up front makes ownership visible and auditable, and lets the rest of the course demonstrate real separation of duties rather than pretend at it.</w:t>
+        <w:t>"who decided `cvv_cd` is HIGH sensitivity, and when?"</w:t>
+      </w:r>
+      <w:r>
+        <w:t>, the answer must be a named steward with the right role. Provisioning distinct, least-privilege accounts up front makes ownership visible and auditable, and lets the rest of the course demonstrate real separation of duties rather than pretend at it.</w:t>
       </w:r>
     </w:p>
     <w:p>
       <w:pPr>
         <w:pStyle w:val="Heading1"/>
       </w:pPr>
-      <w:r>
-        <w:t xml:space="preserve">What you will learn</w:t>
+    </w:p>
+    <w:p>
+      <w:pPr>
+        <w:pStyle w:val="Heading1"/>
+      </w:pPr>
+      <w:r>
+        <w:lastRenderedPageBreak/>
+        <w:t>What you will learn</w:t>
       </w:r>
     </w:p>
     <w:p>
@@ -234,7 +240,7 @@
         <w:spacing w:after="60"/>
       </w:pPr>
       <w:r>
-        <w:t xml:space="preserve">How PDC separates identity (who you are, held in Keycloak) from authorization (what you may do, expressed as PDC roles and communities).</w:t>
+        <w:t>How PDC separates identity (who you are, held in Keycloak) from authorization (what you may do, expressed as PDC roles and communities).</w:t>
       </w:r>
     </w:p>
     <w:p>
@@ -247,7 +253,7 @@
         <w:spacing w:after="60"/>
       </w:pPr>
       <w:r>
-        <w:t xml:space="preserve">The seven default PDC roles across the Business and Expert tiers, and what each one can and cannot do.</w:t>
+        <w:t>The seven default PDC roles across the Business and Expert tiers, and what each one can and cannot do.</w:t>
       </w:r>
     </w:p>
     <w:p>
@@ -260,7 +266,7 @@
         <w:spacing w:after="60"/>
       </w:pPr>
       <w:r>
-        <w:t xml:space="preserve">How to reset the catalog administrator's password in Keycloak and grant it the full set of roles.</w:t>
+        <w:t>How to reset the catalog administrator's password in Keycloak and grant it the full set of roles.</w:t>
       </w:r>
     </w:p>
     <w:p>
@@ -273,7 +279,7 @@
         <w:spacing w:after="60"/>
       </w:pPr>
       <w:r>
-        <w:t xml:space="preserve">How to add each CSCU user in Data Catalog and assign the least-privilege role their work requires.</w:t>
+        <w:t>How to add each CSCU user in Data Catalog and assign the least-privilege role their work requires.</w:t>
       </w:r>
     </w:p>
     <w:p>
@@ -286,7 +292,7 @@
         <w:spacing w:after="60"/>
       </w:pPr>
       <w:r>
-        <w:t xml:space="preserve">Why least privilege and separation of duties are governance controls, not just IT hygiene — and how each steward's expertise keywords later drive the Glossary Generator's auto-assignment of steward, owner and custodian slots.</w:t>
+        <w:t>Why least privilege and separation of duties are governance controls, not just IT hygiene — and how each steward's expertise keywords later drive the Glossary Generator's auto-assignment of steward, owner and custodian slots.</w:t>
       </w:r>
     </w:p>
     <w:p>
@@ -294,7 +300,7 @@
         <w:pStyle w:val="Heading1"/>
       </w:pPr>
       <w:r>
-        <w:t xml:space="preserve">Background: how PDC does identity and access</w:t>
+        <w:t>Background: how PDC does identity and access</w:t>
       </w:r>
     </w:p>
     <w:p>
@@ -311,7 +317,7 @@
           <w:sz w:val="20"/>
           <w:szCs w:val="20"/>
         </w:rPr>
-        <w:t xml:space="preserve">pdc</w:t>
+        <w:t>pdc</w:t>
       </w:r>
       <w:r>
         <w:t xml:space="preserve"> — and PDC authenticates users against the </w:t>
@@ -323,7 +329,7 @@
           <w:sz w:val="20"/>
           <w:szCs w:val="20"/>
         </w:rPr>
-        <w:t xml:space="preserve">pdc-client</w:t>
+        <w:t>pdc-client</w:t>
       </w:r>
       <w:r>
         <w:t xml:space="preserve"> OIDC client. Authorization — what a signed-in user may actually do — is expressed in PDC as roles and communities. In practice this means two places do two jobs: you set or reset a password in </w:t>
@@ -333,7 +339,7 @@
           <w:b/>
           <w:bCs/>
         </w:rPr>
-        <w:t xml:space="preserve">Keycloak</w:t>
+        <w:t>Keycloak</w:t>
       </w:r>
       <w:r>
         <w:t xml:space="preserve">, and you assign roles in </w:t>
@@ -343,10 +349,10 @@
           <w:b/>
           <w:bCs/>
         </w:rPr>
-        <w:t xml:space="preserve">Data Catalog</w:t>
-      </w:r>
-      <w:r>
-        <w:t xml:space="preserve">.</w:t>
+        <w:t>Data Catalog</w:t>
+      </w:r>
+      <w:r>
+        <w:t>.</w:t>
       </w:r>
     </w:p>
     <w:p>
@@ -358,9 +364,9 @@
           <w:right w:val="dashed" w:sz="8" w:space="6" w:color="C8A028"/>
         </w:pBdr>
         <w:shd w:val="clear" w:color="auto" w:fill="FFF7E0"/>
-        <w:jc w:val="center"/>
         <w:spacing w:before="120" w:after="200"/>
         <w:ind w:left="240" w:right="240"/>
+        <w:jc w:val="center"/>
       </w:pPr>
       <w:r>
         <w:rPr>
@@ -368,7 +374,7 @@
           <w:bCs/>
           <w:color w:val="8A6D1A"/>
         </w:rPr>
-        <w:t xml:space="preserve">📷  SCREENSHOT — Keycloak pdc realm beside PDC user management</w:t>
+        <w:t>📷  SCREENSHOT — Keycloak pdc realm beside PDC user management</w:t>
       </w:r>
     </w:p>
     <w:p>
@@ -376,7 +382,7 @@
         <w:spacing w:after="120"/>
       </w:pPr>
       <w:r>
-        <w:t xml:space="preserve">PDC groups its default roles into two licensed tiers. Business Users mostly view and explore; Expert Users create, ingest, and curate. When a user holds more than one role the highest-level role determines effective permissions, and the number of Expert seats you can assign is capped by your licence — worth remembering before you hand out steward roles freely.</w:t>
+        <w:t>PDC groups its default roles into two licensed tiers. Business Users mostly view and explore; Expert Users create, ingest, and curate. When a user holds more than one role the highest-level role determines effective permissions, and the number of Expert seats you can assign is capped by your licence — worth remembering before you hand out steward roles freely.</w:t>
       </w:r>
     </w:p>
     <w:tbl>
@@ -390,6 +396,7 @@
           <w:insideH w:val="single" w:sz="4" w:space="0" w:color="C9DEE8"/>
           <w:insideV w:val="single" w:sz="4" w:space="0" w:color="C9DEE8"/>
         </w:tblBorders>
+        <w:tblLook w:val="04A0" w:firstRow="1" w:lastRow="0" w:firstColumn="1" w:lastColumn="0" w:noHBand="0" w:noVBand="1"/>
       </w:tblPr>
       <w:tblGrid>
         <w:gridCol w:w="2500"/>
@@ -400,27 +407,24 @@
         <w:tc>
           <w:tcPr>
             <w:tcW w:w="2500" w:type="dxa"/>
-            <w:shd w:val="clear" w:color="auto" w:fill="EEF6FA"/>
             <w:tcBorders>
               <w:left w:val="single" w:sz="12" w:space="0" w:color="065A82"/>
             </w:tcBorders>
-            <w:tcMar>
-              <w:top w:w="120" w:type="dxa"/>
-              <w:left w:w="180" w:type="dxa"/>
-              <w:bottom w:w="120" w:type="dxa"/>
-              <w:right w:w="180" w:type="dxa"/>
-            </w:tcMar>
-          </w:tcPr>
-          <w:p>
-            <w:pPr>
-              <w:spacing w:after="0"/>
-            </w:pPr>
+            <w:shd w:val="clear" w:color="auto" w:fill="EEF6FA"/>
+            <w:tcMar>
+              <w:top w:w="120" w:type="dxa"/>
+              <w:left w:w="180" w:type="dxa"/>
+              <w:bottom w:w="120" w:type="dxa"/>
+              <w:right w:w="180" w:type="dxa"/>
+            </w:tcMar>
+          </w:tcPr>
+          <w:p>
             <w:r>
               <w:rPr>
                 <w:b/>
                 <w:bCs/>
               </w:rPr>
-              <w:t xml:space="preserve">Tier</w:t>
+              <w:t>Tier</w:t>
             </w:r>
           </w:p>
         </w:tc>
@@ -436,15 +440,12 @@
             </w:tcMar>
           </w:tcPr>
           <w:p>
-            <w:pPr>
-              <w:spacing w:after="0"/>
-            </w:pPr>
             <w:r>
               <w:rPr>
                 <w:b/>
                 <w:bCs/>
               </w:rPr>
-              <w:t xml:space="preserve">Role</w:t>
+              <w:t>Role</w:t>
             </w:r>
           </w:p>
         </w:tc>
@@ -460,15 +461,12 @@
             </w:tcMar>
           </w:tcPr>
           <w:p>
-            <w:pPr>
-              <w:spacing w:after="0"/>
-            </w:pPr>
             <w:r>
               <w:rPr>
                 <w:b/>
                 <w:bCs/>
               </w:rPr>
-              <w:t xml:space="preserve">What it can do</w:t>
+              <w:t>What it can do</w:t>
             </w:r>
           </w:p>
         </w:tc>
@@ -485,49 +483,40 @@
             </w:tcMar>
           </w:tcPr>
           <w:p>
-            <w:pPr>
-              <w:spacing w:after="0"/>
-            </w:pPr>
-            <w:r>
-              <w:t xml:space="preserve">Business</w:t>
-            </w:r>
-          </w:p>
-        </w:tc>
-        <w:tc>
-          <w:tcPr>
-            <w:tcW w:w="3430" w:type="dxa"/>
-            <w:tcMar>
-              <w:top w:w="120" w:type="dxa"/>
-              <w:left w:w="180" w:type="dxa"/>
-              <w:bottom w:w="120" w:type="dxa"/>
-              <w:right w:w="180" w:type="dxa"/>
-            </w:tcMar>
-          </w:tcPr>
-          <w:p>
-            <w:pPr>
-              <w:spacing w:after="0"/>
-            </w:pPr>
-            <w:r>
-              <w:t xml:space="preserve">Business User</w:t>
-            </w:r>
-          </w:p>
-        </w:tc>
-        <w:tc>
-          <w:tcPr>
-            <w:tcW w:w="3430" w:type="dxa"/>
-            <w:tcMar>
-              <w:top w:w="120" w:type="dxa"/>
-              <w:left w:w="180" w:type="dxa"/>
-              <w:bottom w:w="120" w:type="dxa"/>
-              <w:right w:w="180" w:type="dxa"/>
-            </w:tcMar>
-          </w:tcPr>
-          <w:p>
-            <w:pPr>
-              <w:spacing w:after="0"/>
-            </w:pPr>
-            <w:r>
-              <w:t xml:space="preserve">View business glossaries and policies. No data-source access</w:t>
+            <w:r>
+              <w:t>Business</w:t>
+            </w:r>
+          </w:p>
+        </w:tc>
+        <w:tc>
+          <w:tcPr>
+            <w:tcW w:w="3430" w:type="dxa"/>
+            <w:tcMar>
+              <w:top w:w="120" w:type="dxa"/>
+              <w:left w:w="180" w:type="dxa"/>
+              <w:bottom w:w="120" w:type="dxa"/>
+              <w:right w:w="180" w:type="dxa"/>
+            </w:tcMar>
+          </w:tcPr>
+          <w:p>
+            <w:r>
+              <w:t>Business User</w:t>
+            </w:r>
+          </w:p>
+        </w:tc>
+        <w:tc>
+          <w:tcPr>
+            <w:tcW w:w="3430" w:type="dxa"/>
+            <w:tcMar>
+              <w:top w:w="120" w:type="dxa"/>
+              <w:left w:w="180" w:type="dxa"/>
+              <w:bottom w:w="120" w:type="dxa"/>
+              <w:right w:w="180" w:type="dxa"/>
+            </w:tcMar>
+          </w:tcPr>
+          <w:p>
+            <w:r>
+              <w:t>View business glossaries and policies. No data-source access</w:t>
             </w:r>
           </w:p>
         </w:tc>
@@ -544,49 +533,40 @@
             </w:tcMar>
           </w:tcPr>
           <w:p>
-            <w:pPr>
-              <w:spacing w:after="0"/>
-            </w:pPr>
-            <w:r>
-              <w:t xml:space="preserve">Business</w:t>
-            </w:r>
-          </w:p>
-        </w:tc>
-        <w:tc>
-          <w:tcPr>
-            <w:tcW w:w="3430" w:type="dxa"/>
-            <w:tcMar>
-              <w:top w:w="120" w:type="dxa"/>
-              <w:left w:w="180" w:type="dxa"/>
-              <w:bottom w:w="120" w:type="dxa"/>
-              <w:right w:w="180" w:type="dxa"/>
-            </w:tcMar>
-          </w:tcPr>
-          <w:p>
-            <w:pPr>
-              <w:spacing w:after="0"/>
-            </w:pPr>
-            <w:r>
-              <w:t xml:space="preserve">Data User</w:t>
-            </w:r>
-          </w:p>
-        </w:tc>
-        <w:tc>
-          <w:tcPr>
-            <w:tcW w:w="3430" w:type="dxa"/>
-            <w:tcMar>
-              <w:top w:w="120" w:type="dxa"/>
-              <w:left w:w="180" w:type="dxa"/>
-              <w:bottom w:w="120" w:type="dxa"/>
-              <w:right w:w="180" w:type="dxa"/>
-            </w:tcMar>
-          </w:tcPr>
-          <w:p>
-            <w:pPr>
-              <w:spacing w:after="0"/>
-            </w:pPr>
-            <w:r>
-              <w:t xml:space="preserve">Business User, plus view/add/delete data-source content, dashboards, and BI</w:t>
+            <w:r>
+              <w:t>Business</w:t>
+            </w:r>
+          </w:p>
+        </w:tc>
+        <w:tc>
+          <w:tcPr>
+            <w:tcW w:w="3430" w:type="dxa"/>
+            <w:tcMar>
+              <w:top w:w="120" w:type="dxa"/>
+              <w:left w:w="180" w:type="dxa"/>
+              <w:bottom w:w="120" w:type="dxa"/>
+              <w:right w:w="180" w:type="dxa"/>
+            </w:tcMar>
+          </w:tcPr>
+          <w:p>
+            <w:r>
+              <w:t>Data User</w:t>
+            </w:r>
+          </w:p>
+        </w:tc>
+        <w:tc>
+          <w:tcPr>
+            <w:tcW w:w="3430" w:type="dxa"/>
+            <w:tcMar>
+              <w:top w:w="120" w:type="dxa"/>
+              <w:left w:w="180" w:type="dxa"/>
+              <w:bottom w:w="120" w:type="dxa"/>
+              <w:right w:w="180" w:type="dxa"/>
+            </w:tcMar>
+          </w:tcPr>
+          <w:p>
+            <w:r>
+              <w:t>Business User, plus view/add/delete data-source content, dashboards, and BI</w:t>
             </w:r>
           </w:p>
         </w:tc>
@@ -603,49 +583,40 @@
             </w:tcMar>
           </w:tcPr>
           <w:p>
-            <w:pPr>
-              <w:spacing w:after="0"/>
-            </w:pPr>
-            <w:r>
-              <w:t xml:space="preserve">Expert</w:t>
-            </w:r>
-          </w:p>
-        </w:tc>
-        <w:tc>
-          <w:tcPr>
-            <w:tcW w:w="3430" w:type="dxa"/>
-            <w:tcMar>
-              <w:top w:w="120" w:type="dxa"/>
-              <w:left w:w="180" w:type="dxa"/>
-              <w:bottom w:w="120" w:type="dxa"/>
-              <w:right w:w="180" w:type="dxa"/>
-            </w:tcMar>
-          </w:tcPr>
-          <w:p>
-            <w:pPr>
-              <w:spacing w:after="0"/>
-            </w:pPr>
-            <w:r>
-              <w:t xml:space="preserve">Business Steward</w:t>
-            </w:r>
-          </w:p>
-        </w:tc>
-        <w:tc>
-          <w:tcPr>
-            <w:tcW w:w="3430" w:type="dxa"/>
-            <w:tcMar>
-              <w:top w:w="120" w:type="dxa"/>
-              <w:left w:w="180" w:type="dxa"/>
-              <w:bottom w:w="120" w:type="dxa"/>
-              <w:right w:w="180" w:type="dxa"/>
-            </w:tcMar>
-          </w:tcPr>
-          <w:p>
-            <w:pPr>
-              <w:spacing w:after="0"/>
-            </w:pPr>
-            <w:r>
-              <w:t xml:space="preserve">Create, update, import/export business glossaries and policies. Cannot modify data sources</w:t>
+            <w:r>
+              <w:t>Expert</w:t>
+            </w:r>
+          </w:p>
+        </w:tc>
+        <w:tc>
+          <w:tcPr>
+            <w:tcW w:w="3430" w:type="dxa"/>
+            <w:tcMar>
+              <w:top w:w="120" w:type="dxa"/>
+              <w:left w:w="180" w:type="dxa"/>
+              <w:bottom w:w="120" w:type="dxa"/>
+              <w:right w:w="180" w:type="dxa"/>
+            </w:tcMar>
+          </w:tcPr>
+          <w:p>
+            <w:r>
+              <w:t>Business Steward</w:t>
+            </w:r>
+          </w:p>
+        </w:tc>
+        <w:tc>
+          <w:tcPr>
+            <w:tcW w:w="3430" w:type="dxa"/>
+            <w:tcMar>
+              <w:top w:w="120" w:type="dxa"/>
+              <w:left w:w="180" w:type="dxa"/>
+              <w:bottom w:w="120" w:type="dxa"/>
+              <w:right w:w="180" w:type="dxa"/>
+            </w:tcMar>
+          </w:tcPr>
+          <w:p>
+            <w:r>
+              <w:t>Create, update, import/export business glossaries and policies. Cannot modify data sources</w:t>
             </w:r>
           </w:p>
         </w:tc>
@@ -662,49 +633,40 @@
             </w:tcMar>
           </w:tcPr>
           <w:p>
-            <w:pPr>
-              <w:spacing w:after="0"/>
-            </w:pPr>
-            <w:r>
-              <w:t xml:space="preserve">Expert</w:t>
-            </w:r>
-          </w:p>
-        </w:tc>
-        <w:tc>
-          <w:tcPr>
-            <w:tcW w:w="3430" w:type="dxa"/>
-            <w:tcMar>
-              <w:top w:w="120" w:type="dxa"/>
-              <w:left w:w="180" w:type="dxa"/>
-              <w:bottom w:w="120" w:type="dxa"/>
-              <w:right w:w="180" w:type="dxa"/>
-            </w:tcMar>
-          </w:tcPr>
-          <w:p>
-            <w:pPr>
-              <w:spacing w:after="0"/>
-            </w:pPr>
-            <w:r>
-              <w:t xml:space="preserve">Data Steward</w:t>
-            </w:r>
-          </w:p>
-        </w:tc>
-        <w:tc>
-          <w:tcPr>
-            <w:tcW w:w="3430" w:type="dxa"/>
-            <w:tcMar>
-              <w:top w:w="120" w:type="dxa"/>
-              <w:left w:w="180" w:type="dxa"/>
-              <w:bottom w:w="120" w:type="dxa"/>
-              <w:right w:w="180" w:type="dxa"/>
-            </w:tcMar>
-          </w:tcPr>
-          <w:p>
-            <w:pPr>
-              <w:spacing w:after="0"/>
-            </w:pPr>
-            <w:r>
-              <w:t xml:space="preserve">Create and manage data sources, profiling, business rules, data-identification methods, and reference data</w:t>
+            <w:r>
+              <w:t>Expert</w:t>
+            </w:r>
+          </w:p>
+        </w:tc>
+        <w:tc>
+          <w:tcPr>
+            <w:tcW w:w="3430" w:type="dxa"/>
+            <w:tcMar>
+              <w:top w:w="120" w:type="dxa"/>
+              <w:left w:w="180" w:type="dxa"/>
+              <w:bottom w:w="120" w:type="dxa"/>
+              <w:right w:w="180" w:type="dxa"/>
+            </w:tcMar>
+          </w:tcPr>
+          <w:p>
+            <w:r>
+              <w:t>Data Steward</w:t>
+            </w:r>
+          </w:p>
+        </w:tc>
+        <w:tc>
+          <w:tcPr>
+            <w:tcW w:w="3430" w:type="dxa"/>
+            <w:tcMar>
+              <w:top w:w="120" w:type="dxa"/>
+              <w:left w:w="180" w:type="dxa"/>
+              <w:bottom w:w="120" w:type="dxa"/>
+              <w:right w:w="180" w:type="dxa"/>
+            </w:tcMar>
+          </w:tcPr>
+          <w:p>
+            <w:r>
+              <w:t>Create and manage data sources, profiling, business rules, data-identification methods, and reference data</w:t>
             </w:r>
           </w:p>
         </w:tc>
@@ -721,49 +683,41 @@
             </w:tcMar>
           </w:tcPr>
           <w:p>
-            <w:pPr>
-              <w:spacing w:after="0"/>
-            </w:pPr>
-            <w:r>
-              <w:t xml:space="preserve">Expert</w:t>
-            </w:r>
-          </w:p>
-        </w:tc>
-        <w:tc>
-          <w:tcPr>
-            <w:tcW w:w="3430" w:type="dxa"/>
-            <w:tcMar>
-              <w:top w:w="120" w:type="dxa"/>
-              <w:left w:w="180" w:type="dxa"/>
-              <w:bottom w:w="120" w:type="dxa"/>
-              <w:right w:w="180" w:type="dxa"/>
-            </w:tcMar>
-          </w:tcPr>
-          <w:p>
-            <w:pPr>
-              <w:spacing w:after="0"/>
-            </w:pPr>
-            <w:r>
-              <w:t xml:space="preserve">Admin</w:t>
-            </w:r>
-          </w:p>
-        </w:tc>
-        <w:tc>
-          <w:tcPr>
-            <w:tcW w:w="3430" w:type="dxa"/>
-            <w:tcMar>
-              <w:top w:w="120" w:type="dxa"/>
-              <w:left w:w="180" w:type="dxa"/>
-              <w:bottom w:w="120" w:type="dxa"/>
-              <w:right w:w="180" w:type="dxa"/>
-            </w:tcMar>
-          </w:tcPr>
-          <w:p>
-            <w:pPr>
-              <w:spacing w:after="0"/>
-            </w:pPr>
-            <w:r>
-              <w:t xml:space="preserve">Manage user accounts, roles, permissions, and system configuration. Can view — but not author — business rules</w:t>
+            <w:r>
+              <w:lastRenderedPageBreak/>
+              <w:t>Expert</w:t>
+            </w:r>
+          </w:p>
+        </w:tc>
+        <w:tc>
+          <w:tcPr>
+            <w:tcW w:w="3430" w:type="dxa"/>
+            <w:tcMar>
+              <w:top w:w="120" w:type="dxa"/>
+              <w:left w:w="180" w:type="dxa"/>
+              <w:bottom w:w="120" w:type="dxa"/>
+              <w:right w:w="180" w:type="dxa"/>
+            </w:tcMar>
+          </w:tcPr>
+          <w:p>
+            <w:r>
+              <w:t>Admin</w:t>
+            </w:r>
+          </w:p>
+        </w:tc>
+        <w:tc>
+          <w:tcPr>
+            <w:tcW w:w="3430" w:type="dxa"/>
+            <w:tcMar>
+              <w:top w:w="120" w:type="dxa"/>
+              <w:left w:w="180" w:type="dxa"/>
+              <w:bottom w:w="120" w:type="dxa"/>
+              <w:right w:w="180" w:type="dxa"/>
+            </w:tcMar>
+          </w:tcPr>
+          <w:p>
+            <w:r>
+              <w:t>Manage user accounts, roles, permissions, and system configuration. Can view — but not author — business rules</w:t>
             </w:r>
           </w:p>
         </w:tc>
@@ -780,49 +734,40 @@
             </w:tcMar>
           </w:tcPr>
           <w:p>
-            <w:pPr>
-              <w:spacing w:after="0"/>
-            </w:pPr>
-            <w:r>
-              <w:t xml:space="preserve">Expert</w:t>
-            </w:r>
-          </w:p>
-        </w:tc>
-        <w:tc>
-          <w:tcPr>
-            <w:tcW w:w="3430" w:type="dxa"/>
-            <w:tcMar>
-              <w:top w:w="120" w:type="dxa"/>
-              <w:left w:w="180" w:type="dxa"/>
-              <w:bottom w:w="120" w:type="dxa"/>
-              <w:right w:w="180" w:type="dxa"/>
-            </w:tcMar>
-          </w:tcPr>
-          <w:p>
-            <w:pPr>
-              <w:spacing w:after="0"/>
-            </w:pPr>
-            <w:r>
-              <w:t xml:space="preserve">Data Storage Administrator</w:t>
-            </w:r>
-          </w:p>
-        </w:tc>
-        <w:tc>
-          <w:tcPr>
-            <w:tcW w:w="3430" w:type="dxa"/>
-            <w:tcMar>
-              <w:top w:w="120" w:type="dxa"/>
-              <w:left w:w="180" w:type="dxa"/>
-              <w:bottom w:w="120" w:type="dxa"/>
-              <w:right w:w="180" w:type="dxa"/>
-            </w:tcMar>
-          </w:tcPr>
-          <w:p>
-            <w:pPr>
-              <w:spacing w:after="0"/>
-            </w:pPr>
-            <w:r>
-              <w:t xml:space="preserve">Manage data sources, storage utilisation and tiering across sources, folders, and schemas; author identification methods</w:t>
+            <w:r>
+              <w:t>Expert</w:t>
+            </w:r>
+          </w:p>
+        </w:tc>
+        <w:tc>
+          <w:tcPr>
+            <w:tcW w:w="3430" w:type="dxa"/>
+            <w:tcMar>
+              <w:top w:w="120" w:type="dxa"/>
+              <w:left w:w="180" w:type="dxa"/>
+              <w:bottom w:w="120" w:type="dxa"/>
+              <w:right w:w="180" w:type="dxa"/>
+            </w:tcMar>
+          </w:tcPr>
+          <w:p>
+            <w:r>
+              <w:t>Data Storage Administrator</w:t>
+            </w:r>
+          </w:p>
+        </w:tc>
+        <w:tc>
+          <w:tcPr>
+            <w:tcW w:w="3430" w:type="dxa"/>
+            <w:tcMar>
+              <w:top w:w="120" w:type="dxa"/>
+              <w:left w:w="180" w:type="dxa"/>
+              <w:bottom w:w="120" w:type="dxa"/>
+              <w:right w:w="180" w:type="dxa"/>
+            </w:tcMar>
+          </w:tcPr>
+          <w:p>
+            <w:r>
+              <w:t>Manage data sources, storage utilisation and tiering across sources, folders, and schemas; author identification methods</w:t>
             </w:r>
           </w:p>
         </w:tc>
@@ -839,49 +784,40 @@
             </w:tcMar>
           </w:tcPr>
           <w:p>
-            <w:pPr>
-              <w:spacing w:after="0"/>
-            </w:pPr>
-            <w:r>
-              <w:t xml:space="preserve">Expert</w:t>
-            </w:r>
-          </w:p>
-        </w:tc>
-        <w:tc>
-          <w:tcPr>
-            <w:tcW w:w="3430" w:type="dxa"/>
-            <w:tcMar>
-              <w:top w:w="120" w:type="dxa"/>
-              <w:left w:w="180" w:type="dxa"/>
-              <w:bottom w:w="120" w:type="dxa"/>
-              <w:right w:w="180" w:type="dxa"/>
-            </w:tcMar>
-          </w:tcPr>
-          <w:p>
-            <w:pPr>
-              <w:spacing w:after="0"/>
-            </w:pPr>
-            <w:r>
-              <w:t xml:space="preserve">Data Developer</w:t>
-            </w:r>
-          </w:p>
-        </w:tc>
-        <w:tc>
-          <w:tcPr>
-            <w:tcW w:w="3430" w:type="dxa"/>
-            <w:tcMar>
-              <w:top w:w="120" w:type="dxa"/>
-              <w:left w:w="180" w:type="dxa"/>
-              <w:bottom w:w="120" w:type="dxa"/>
-              <w:right w:w="180" w:type="dxa"/>
-            </w:tcMar>
-          </w:tcPr>
-          <w:p>
-            <w:pPr>
-              <w:spacing w:after="0"/>
-            </w:pPr>
-            <w:r>
-              <w:t xml:space="preserve">Design and maintain business rules, metadata and MDM rules, and data-domain logic</w:t>
+            <w:r>
+              <w:t>Expert</w:t>
+            </w:r>
+          </w:p>
+        </w:tc>
+        <w:tc>
+          <w:tcPr>
+            <w:tcW w:w="3430" w:type="dxa"/>
+            <w:tcMar>
+              <w:top w:w="120" w:type="dxa"/>
+              <w:left w:w="180" w:type="dxa"/>
+              <w:bottom w:w="120" w:type="dxa"/>
+              <w:right w:w="180" w:type="dxa"/>
+            </w:tcMar>
+          </w:tcPr>
+          <w:p>
+            <w:r>
+              <w:t>Data Developer</w:t>
+            </w:r>
+          </w:p>
+        </w:tc>
+        <w:tc>
+          <w:tcPr>
+            <w:tcW w:w="3430" w:type="dxa"/>
+            <w:tcMar>
+              <w:top w:w="120" w:type="dxa"/>
+              <w:left w:w="180" w:type="dxa"/>
+              <w:bottom w:w="120" w:type="dxa"/>
+              <w:right w:w="180" w:type="dxa"/>
+            </w:tcMar>
+          </w:tcPr>
+          <w:p>
+            <w:r>
+              <w:t>Design and maintain business rules, metadata and MDM rules, and data-domain logic</w:t>
             </w:r>
           </w:p>
         </w:tc>
@@ -904,7 +840,7 @@
           <w:b/>
           <w:bCs/>
         </w:rPr>
-        <w:t xml:space="preserve">communities</w:t>
+        <w:t>communities</w:t>
       </w:r>
       <w:r>
         <w:t xml:space="preserve"> — custom roles built on a base role that narrow or widen access to specific assets (a Lending community that sees only lending glossaries, for example). This workshop uses the default roles; communities become useful once CSCU scopes access by department.</w:t>
@@ -912,10 +848,101 @@
     </w:p>
     <w:p>
       <w:pPr>
+        <w:spacing w:after="120"/>
+      </w:pPr>
+    </w:p>
+    <w:p>
+      <w:pPr>
+        <w:spacing w:after="120"/>
+      </w:pPr>
+    </w:p>
+    <w:p>
+      <w:pPr>
+        <w:spacing w:after="120"/>
+      </w:pPr>
+    </w:p>
+    <w:p>
+      <w:pPr>
+        <w:spacing w:after="120"/>
+      </w:pPr>
+    </w:p>
+    <w:p>
+      <w:pPr>
+        <w:spacing w:after="120"/>
+      </w:pPr>
+    </w:p>
+    <w:p>
+      <w:pPr>
+        <w:spacing w:after="120"/>
+      </w:pPr>
+    </w:p>
+    <w:p>
+      <w:pPr>
+        <w:spacing w:after="120"/>
+      </w:pPr>
+    </w:p>
+    <w:p>
+      <w:pPr>
+        <w:spacing w:after="120"/>
+      </w:pPr>
+    </w:p>
+    <w:p>
+      <w:pPr>
+        <w:spacing w:after="120"/>
+      </w:pPr>
+    </w:p>
+    <w:p>
+      <w:pPr>
+        <w:spacing w:after="120"/>
+      </w:pPr>
+    </w:p>
+    <w:p>
+      <w:pPr>
+        <w:spacing w:after="120"/>
+      </w:pPr>
+    </w:p>
+    <w:p>
+      <w:pPr>
+        <w:spacing w:after="120"/>
+      </w:pPr>
+    </w:p>
+    <w:p>
+      <w:pPr>
+        <w:spacing w:after="120"/>
+      </w:pPr>
+    </w:p>
+    <w:p>
+      <w:pPr>
+        <w:spacing w:after="120"/>
+      </w:pPr>
+    </w:p>
+    <w:p>
+      <w:pPr>
+        <w:spacing w:after="120"/>
+      </w:pPr>
+    </w:p>
+    <w:p>
+      <w:pPr>
+        <w:spacing w:after="120"/>
+      </w:pPr>
+    </w:p>
+    <w:p>
+      <w:pPr>
+        <w:spacing w:after="120"/>
+      </w:pPr>
+    </w:p>
+    <w:p>
+      <w:pPr>
+        <w:spacing w:after="120"/>
+      </w:pPr>
+    </w:p>
+    <w:p>
+      <w:pPr>
         <w:pStyle w:val="Heading1"/>
       </w:pPr>
       <w:r>
-        <w:t xml:space="preserve">Before you begin</w:t>
+        <w:lastRenderedPageBreak/>
+        <w:t>Before you begin</w:t>
       </w:r>
     </w:p>
     <w:p>
@@ -923,7 +950,7 @@
         <w:pStyle w:val="Heading2"/>
       </w:pPr>
       <w:r>
-        <w:t xml:space="preserve">Prerequisites</w:t>
+        <w:t>Prerequisites</w:t>
       </w:r>
     </w:p>
     <w:p>
@@ -936,7 +963,7 @@
         <w:spacing w:after="60"/>
       </w:pPr>
       <w:r>
-        <w:t xml:space="preserve">A running PDC 11.0.0 instance with its Keycloak reachable, and the Keycloak administrator credentials (master-realm admin) to reset passwords.</w:t>
+        <w:t>A running PDC 11.0.0 instance with its Keycloak reachable, and the Keycloak administrator credentials (master-realm admin) to reset passwords.</w:t>
       </w:r>
     </w:p>
     <w:p>
@@ -958,10 +985,10 @@
           <w:sz w:val="20"/>
           <w:szCs w:val="20"/>
         </w:rPr>
-        <w:t xml:space="preserve">catalog.admin</w:t>
-      </w:r>
-      <w:r>
-        <w:t xml:space="preserve">.</w:t>
+        <w:t>catalog.admin</w:t>
+      </w:r>
+      <w:r>
+        <w:t>.</w:t>
       </w:r>
     </w:p>
     <w:p>
@@ -974,7 +1001,7 @@
         <w:spacing w:after="60"/>
       </w:pPr>
       <w:r>
-        <w:t xml:space="preserve">The CSCU roster below (</w:t>
+        <w:t>The CSCU roster below (</w:t>
       </w:r>
       <w:r>
         <w:rPr>
@@ -983,7 +1010,7 @@
           <w:sz w:val="20"/>
           <w:szCs w:val="20"/>
         </w:rPr>
-        <w:t xml:space="preserve">assets/users.csv</w:t>
+        <w:t>assets/users.csv</w:t>
       </w:r>
       <w:r>
         <w:t xml:space="preserve">). All CSCU emails follow the pattern </w:t>
@@ -995,10 +1022,10 @@
           <w:sz w:val="20"/>
           <w:szCs w:val="20"/>
         </w:rPr>
-        <w:t xml:space="preserve">name@copperstatecu.org</w:t>
-      </w:r>
-      <w:r>
-        <w:t xml:space="preserve">.</w:t>
+        <w:t>name@copperstatecu.org</w:t>
+      </w:r>
+      <w:r>
+        <w:t>.</w:t>
       </w:r>
     </w:p>
     <w:p>
@@ -1006,7 +1033,7 @@
         <w:pStyle w:val="Heading2"/>
       </w:pPr>
       <w:r>
-        <w:t xml:space="preserve">Reference — admin parameters</w:t>
+        <w:t>Reference — admin parameters</w:t>
       </w:r>
     </w:p>
     <w:p>
@@ -1023,7 +1050,7 @@
           <w:sz w:val="20"/>
           <w:szCs w:val="20"/>
         </w:rPr>
-        <w:t xml:space="preserve">pentaho.io</w:t>
+        <w:t>pentaho.io</w:t>
       </w:r>
       <w:r>
         <w:t xml:space="preserve"> appears.</w:t>
@@ -1040,6 +1067,7 @@
           <w:insideH w:val="single" w:sz="4" w:space="0" w:color="C9DEE8"/>
           <w:insideV w:val="single" w:sz="4" w:space="0" w:color="C9DEE8"/>
         </w:tblBorders>
+        <w:tblLook w:val="04A0" w:firstRow="1" w:lastRow="0" w:firstColumn="1" w:lastColumn="0" w:noHBand="0" w:noVBand="1"/>
       </w:tblPr>
       <w:tblGrid>
         <w:gridCol w:w="2500"/>
@@ -1050,27 +1078,24 @@
         <w:tc>
           <w:tcPr>
             <w:tcW w:w="2500" w:type="dxa"/>
-            <w:shd w:val="clear" w:color="auto" w:fill="EEF6FA"/>
             <w:tcBorders>
               <w:left w:val="single" w:sz="12" w:space="0" w:color="065A82"/>
             </w:tcBorders>
-            <w:tcMar>
-              <w:top w:w="120" w:type="dxa"/>
-              <w:left w:w="180" w:type="dxa"/>
-              <w:bottom w:w="120" w:type="dxa"/>
-              <w:right w:w="180" w:type="dxa"/>
-            </w:tcMar>
-          </w:tcPr>
-          <w:p>
-            <w:pPr>
-              <w:spacing w:after="0"/>
-            </w:pPr>
+            <w:shd w:val="clear" w:color="auto" w:fill="EEF6FA"/>
+            <w:tcMar>
+              <w:top w:w="120" w:type="dxa"/>
+              <w:left w:w="180" w:type="dxa"/>
+              <w:bottom w:w="120" w:type="dxa"/>
+              <w:right w:w="180" w:type="dxa"/>
+            </w:tcMar>
+          </w:tcPr>
+          <w:p>
             <w:r>
               <w:rPr>
                 <w:b/>
                 <w:bCs/>
               </w:rPr>
-              <w:t xml:space="preserve">Field</w:t>
+              <w:t>Field</w:t>
             </w:r>
           </w:p>
         </w:tc>
@@ -1086,15 +1111,12 @@
             </w:tcMar>
           </w:tcPr>
           <w:p>
-            <w:pPr>
-              <w:spacing w:after="0"/>
-            </w:pPr>
             <w:r>
               <w:rPr>
                 <w:b/>
                 <w:bCs/>
               </w:rPr>
-              <w:t xml:space="preserve">Value</w:t>
+              <w:t>Value</w:t>
             </w:r>
           </w:p>
         </w:tc>
@@ -1110,15 +1132,12 @@
             </w:tcMar>
           </w:tcPr>
           <w:p>
-            <w:pPr>
-              <w:spacing w:after="0"/>
-            </w:pPr>
             <w:r>
               <w:rPr>
                 <w:b/>
                 <w:bCs/>
               </w:rPr>
-              <w:t xml:space="preserve">Notes</w:t>
+              <w:t>Notes</w:t>
             </w:r>
           </w:p>
         </w:tc>
@@ -1135,49 +1154,40 @@
             </w:tcMar>
           </w:tcPr>
           <w:p>
-            <w:pPr>
-              <w:spacing w:after="0"/>
-            </w:pPr>
-            <w:r>
-              <w:t xml:space="preserve">PDC console</w:t>
-            </w:r>
-          </w:p>
-        </w:tc>
-        <w:tc>
-          <w:tcPr>
-            <w:tcW w:w="3430" w:type="dxa"/>
-            <w:tcMar>
-              <w:top w:w="120" w:type="dxa"/>
-              <w:left w:w="180" w:type="dxa"/>
-              <w:bottom w:w="120" w:type="dxa"/>
-              <w:right w:w="180" w:type="dxa"/>
-            </w:tcMar>
-          </w:tcPr>
-          <w:p>
-            <w:pPr>
-              <w:spacing w:after="0"/>
-            </w:pPr>
-            <w:r>
-              <w:t xml:space="preserve">https://pentaho.io</w:t>
-            </w:r>
-          </w:p>
-        </w:tc>
-        <w:tc>
-          <w:tcPr>
-            <w:tcW w:w="3430" w:type="dxa"/>
-            <w:tcMar>
-              <w:top w:w="120" w:type="dxa"/>
-              <w:left w:w="180" w:type="dxa"/>
-              <w:bottom w:w="120" w:type="dxa"/>
-              <w:right w:w="180" w:type="dxa"/>
-            </w:tcMar>
-          </w:tcPr>
-          <w:p>
-            <w:pPr>
-              <w:spacing w:after="0"/>
-            </w:pPr>
-            <w:r>
-              <w:t xml:space="preserve">Your instance root</w:t>
+            <w:r>
+              <w:t>PDC console</w:t>
+            </w:r>
+          </w:p>
+        </w:tc>
+        <w:tc>
+          <w:tcPr>
+            <w:tcW w:w="3430" w:type="dxa"/>
+            <w:tcMar>
+              <w:top w:w="120" w:type="dxa"/>
+              <w:left w:w="180" w:type="dxa"/>
+              <w:bottom w:w="120" w:type="dxa"/>
+              <w:right w:w="180" w:type="dxa"/>
+            </w:tcMar>
+          </w:tcPr>
+          <w:p>
+            <w:r>
+              <w:t>https://pentaho.io</w:t>
+            </w:r>
+          </w:p>
+        </w:tc>
+        <w:tc>
+          <w:tcPr>
+            <w:tcW w:w="3430" w:type="dxa"/>
+            <w:tcMar>
+              <w:top w:w="120" w:type="dxa"/>
+              <w:left w:w="180" w:type="dxa"/>
+              <w:bottom w:w="120" w:type="dxa"/>
+              <w:right w:w="180" w:type="dxa"/>
+            </w:tcMar>
+          </w:tcPr>
+          <w:p>
+            <w:r>
+              <w:t>Your instance root</w:t>
             </w:r>
           </w:p>
         </w:tc>
@@ -1194,49 +1204,40 @@
             </w:tcMar>
           </w:tcPr>
           <w:p>
-            <w:pPr>
-              <w:spacing w:after="0"/>
-            </w:pPr>
-            <w:r>
-              <w:t xml:space="preserve">Keycloak admin</w:t>
-            </w:r>
-          </w:p>
-        </w:tc>
-        <w:tc>
-          <w:tcPr>
-            <w:tcW w:w="3430" w:type="dxa"/>
-            <w:tcMar>
-              <w:top w:w="120" w:type="dxa"/>
-              <w:left w:w="180" w:type="dxa"/>
-              <w:bottom w:w="120" w:type="dxa"/>
-              <w:right w:w="180" w:type="dxa"/>
-            </w:tcMar>
-          </w:tcPr>
-          <w:p>
-            <w:pPr>
-              <w:spacing w:after="0"/>
-            </w:pPr>
-            <w:r>
-              <w:t xml:space="preserve">https://pentaho.io/keycloak</w:t>
-            </w:r>
-          </w:p>
-        </w:tc>
-        <w:tc>
-          <w:tcPr>
-            <w:tcW w:w="3430" w:type="dxa"/>
-            <w:tcMar>
-              <w:top w:w="120" w:type="dxa"/>
-              <w:left w:w="180" w:type="dxa"/>
-              <w:bottom w:w="120" w:type="dxa"/>
-              <w:right w:w="180" w:type="dxa"/>
-            </w:tcMar>
-          </w:tcPr>
-          <w:p>
-            <w:pPr>
-              <w:spacing w:after="0"/>
-            </w:pPr>
-            <w:r>
-              <w:t xml:space="preserve">Admin console; sign in, then select the realm below</w:t>
+            <w:r>
+              <w:t>Keycloak admin</w:t>
+            </w:r>
+          </w:p>
+        </w:tc>
+        <w:tc>
+          <w:tcPr>
+            <w:tcW w:w="3430" w:type="dxa"/>
+            <w:tcMar>
+              <w:top w:w="120" w:type="dxa"/>
+              <w:left w:w="180" w:type="dxa"/>
+              <w:bottom w:w="120" w:type="dxa"/>
+              <w:right w:w="180" w:type="dxa"/>
+            </w:tcMar>
+          </w:tcPr>
+          <w:p>
+            <w:r>
+              <w:t>https://pentaho.io/keycloak</w:t>
+            </w:r>
+          </w:p>
+        </w:tc>
+        <w:tc>
+          <w:tcPr>
+            <w:tcW w:w="3430" w:type="dxa"/>
+            <w:tcMar>
+              <w:top w:w="120" w:type="dxa"/>
+              <w:left w:w="180" w:type="dxa"/>
+              <w:bottom w:w="120" w:type="dxa"/>
+              <w:right w:w="180" w:type="dxa"/>
+            </w:tcMar>
+          </w:tcPr>
+          <w:p>
+            <w:r>
+              <w:t>Admin console; sign in, then select the realm below</w:t>
             </w:r>
           </w:p>
         </w:tc>
@@ -1253,47 +1254,38 @@
             </w:tcMar>
           </w:tcPr>
           <w:p>
-            <w:pPr>
-              <w:spacing w:after="0"/>
-            </w:pPr>
-            <w:r>
-              <w:t xml:space="preserve">Realm</w:t>
-            </w:r>
-          </w:p>
-        </w:tc>
-        <w:tc>
-          <w:tcPr>
-            <w:tcW w:w="3430" w:type="dxa"/>
-            <w:tcMar>
-              <w:top w:w="120" w:type="dxa"/>
-              <w:left w:w="180" w:type="dxa"/>
-              <w:bottom w:w="120" w:type="dxa"/>
-              <w:right w:w="180" w:type="dxa"/>
-            </w:tcMar>
-          </w:tcPr>
-          <w:p>
-            <w:pPr>
-              <w:spacing w:after="0"/>
-            </w:pPr>
-            <w:r>
-              <w:t xml:space="preserve">pdc</w:t>
-            </w:r>
-          </w:p>
-        </w:tc>
-        <w:tc>
-          <w:tcPr>
-            <w:tcW w:w="3430" w:type="dxa"/>
-            <w:tcMar>
-              <w:top w:w="120" w:type="dxa"/>
-              <w:left w:w="180" w:type="dxa"/>
-              <w:bottom w:w="120" w:type="dxa"/>
-              <w:right w:w="180" w:type="dxa"/>
-            </w:tcMar>
-          </w:tcPr>
-          <w:p>
-            <w:pPr>
-              <w:spacing w:after="0"/>
-            </w:pPr>
+            <w:r>
+              <w:t>Realm</w:t>
+            </w:r>
+          </w:p>
+        </w:tc>
+        <w:tc>
+          <w:tcPr>
+            <w:tcW w:w="3430" w:type="dxa"/>
+            <w:tcMar>
+              <w:top w:w="120" w:type="dxa"/>
+              <w:left w:w="180" w:type="dxa"/>
+              <w:bottom w:w="120" w:type="dxa"/>
+              <w:right w:w="180" w:type="dxa"/>
+            </w:tcMar>
+          </w:tcPr>
+          <w:p>
+            <w:r>
+              <w:t>pdc</w:t>
+            </w:r>
+          </w:p>
+        </w:tc>
+        <w:tc>
+          <w:tcPr>
+            <w:tcW w:w="3430" w:type="dxa"/>
+            <w:tcMar>
+              <w:top w:w="120" w:type="dxa"/>
+              <w:left w:w="180" w:type="dxa"/>
+              <w:bottom w:w="120" w:type="dxa"/>
+              <w:right w:w="180" w:type="dxa"/>
+            </w:tcMar>
+          </w:tcPr>
+          <w:p>
             <w:r>
               <w:t xml:space="preserve">The PDC tenant realm — not </w:t>
             </w:r>
@@ -1304,7 +1296,7 @@
                 <w:sz w:val="20"/>
                 <w:szCs w:val="20"/>
               </w:rPr>
-              <w:t xml:space="preserve">master</w:t>
+              <w:t>master</w:t>
             </w:r>
           </w:p>
         </w:tc>
@@ -1321,49 +1313,40 @@
             </w:tcMar>
           </w:tcPr>
           <w:p>
-            <w:pPr>
-              <w:spacing w:after="0"/>
-            </w:pPr>
-            <w:r>
-              <w:t xml:space="preserve">OIDC client</w:t>
-            </w:r>
-          </w:p>
-        </w:tc>
-        <w:tc>
-          <w:tcPr>
-            <w:tcW w:w="3430" w:type="dxa"/>
-            <w:tcMar>
-              <w:top w:w="120" w:type="dxa"/>
-              <w:left w:w="180" w:type="dxa"/>
-              <w:bottom w:w="120" w:type="dxa"/>
-              <w:right w:w="180" w:type="dxa"/>
-            </w:tcMar>
-          </w:tcPr>
-          <w:p>
-            <w:pPr>
-              <w:spacing w:after="0"/>
-            </w:pPr>
-            <w:r>
-              <w:t xml:space="preserve">pdc-client</w:t>
-            </w:r>
-          </w:p>
-        </w:tc>
-        <w:tc>
-          <w:tcPr>
-            <w:tcW w:w="3430" w:type="dxa"/>
-            <w:tcMar>
-              <w:top w:w="120" w:type="dxa"/>
-              <w:left w:w="180" w:type="dxa"/>
-              <w:bottom w:w="120" w:type="dxa"/>
-              <w:right w:w="180" w:type="dxa"/>
-            </w:tcMar>
-          </w:tcPr>
-          <w:p>
-            <w:pPr>
-              <w:spacing w:after="0"/>
-            </w:pPr>
-            <w:r>
-              <w:t xml:space="preserve">The client PDC authenticates against</w:t>
+            <w:r>
+              <w:t>OIDC client</w:t>
+            </w:r>
+          </w:p>
+        </w:tc>
+        <w:tc>
+          <w:tcPr>
+            <w:tcW w:w="3430" w:type="dxa"/>
+            <w:tcMar>
+              <w:top w:w="120" w:type="dxa"/>
+              <w:left w:w="180" w:type="dxa"/>
+              <w:bottom w:w="120" w:type="dxa"/>
+              <w:right w:w="180" w:type="dxa"/>
+            </w:tcMar>
+          </w:tcPr>
+          <w:p>
+            <w:r>
+              <w:t>pdc-client</w:t>
+            </w:r>
+          </w:p>
+        </w:tc>
+        <w:tc>
+          <w:tcPr>
+            <w:tcW w:w="3430" w:type="dxa"/>
+            <w:tcMar>
+              <w:top w:w="120" w:type="dxa"/>
+              <w:left w:w="180" w:type="dxa"/>
+              <w:bottom w:w="120" w:type="dxa"/>
+              <w:right w:w="180" w:type="dxa"/>
+            </w:tcMar>
+          </w:tcPr>
+          <w:p>
+            <w:r>
+              <w:t>The client PDC authenticates against</w:t>
             </w:r>
           </w:p>
         </w:tc>
@@ -1380,49 +1363,40 @@
             </w:tcMar>
           </w:tcPr>
           <w:p>
-            <w:pPr>
-              <w:spacing w:after="0"/>
-            </w:pPr>
-            <w:r>
-              <w:t xml:space="preserve">Admin user</w:t>
-            </w:r>
-          </w:p>
-        </w:tc>
-        <w:tc>
-          <w:tcPr>
-            <w:tcW w:w="3430" w:type="dxa"/>
-            <w:tcMar>
-              <w:top w:w="120" w:type="dxa"/>
-              <w:left w:w="180" w:type="dxa"/>
-              <w:bottom w:w="120" w:type="dxa"/>
-              <w:right w:w="180" w:type="dxa"/>
-            </w:tcMar>
-          </w:tcPr>
-          <w:p>
-            <w:pPr>
-              <w:spacing w:after="0"/>
-            </w:pPr>
-            <w:r>
-              <w:t xml:space="preserve">catalog.admin</w:t>
-            </w:r>
-          </w:p>
-        </w:tc>
-        <w:tc>
-          <w:tcPr>
-            <w:tcW w:w="3430" w:type="dxa"/>
-            <w:tcMar>
-              <w:top w:w="120" w:type="dxa"/>
-              <w:left w:w="180" w:type="dxa"/>
-              <w:bottom w:w="120" w:type="dxa"/>
-              <w:right w:w="180" w:type="dxa"/>
-            </w:tcMar>
-          </w:tcPr>
-          <w:p>
-            <w:pPr>
-              <w:spacing w:after="0"/>
-            </w:pPr>
-            <w:r>
-              <w:t xml:space="preserve">Reset its password (Part A)</w:t>
+            <w:r>
+              <w:t>Admin user</w:t>
+            </w:r>
+          </w:p>
+        </w:tc>
+        <w:tc>
+          <w:tcPr>
+            <w:tcW w:w="3430" w:type="dxa"/>
+            <w:tcMar>
+              <w:top w:w="120" w:type="dxa"/>
+              <w:left w:w="180" w:type="dxa"/>
+              <w:bottom w:w="120" w:type="dxa"/>
+              <w:right w:w="180" w:type="dxa"/>
+            </w:tcMar>
+          </w:tcPr>
+          <w:p>
+            <w:r>
+              <w:t>catalog.admin</w:t>
+            </w:r>
+          </w:p>
+        </w:tc>
+        <w:tc>
+          <w:tcPr>
+            <w:tcW w:w="3430" w:type="dxa"/>
+            <w:tcMar>
+              <w:top w:w="120" w:type="dxa"/>
+              <w:left w:w="180" w:type="dxa"/>
+              <w:bottom w:w="120" w:type="dxa"/>
+              <w:right w:w="180" w:type="dxa"/>
+            </w:tcMar>
+          </w:tcPr>
+          <w:p>
+            <w:r>
+              <w:t>Reset its password (Part A)</w:t>
             </w:r>
           </w:p>
         </w:tc>
@@ -1439,49 +1413,40 @@
             </w:tcMar>
           </w:tcPr>
           <w:p>
-            <w:pPr>
-              <w:spacing w:after="0"/>
-            </w:pPr>
-            <w:r>
-              <w:t xml:space="preserve">Admin password</w:t>
-            </w:r>
-          </w:p>
-        </w:tc>
-        <w:tc>
-          <w:tcPr>
-            <w:tcW w:w="3430" w:type="dxa"/>
-            <w:tcMar>
-              <w:top w:w="120" w:type="dxa"/>
-              <w:left w:w="180" w:type="dxa"/>
-              <w:bottom w:w="120" w:type="dxa"/>
-              <w:right w:w="180" w:type="dxa"/>
-            </w:tcMar>
-          </w:tcPr>
-          <w:p>
-            <w:pPr>
-              <w:spacing w:after="0"/>
-            </w:pPr>
-            <w:r>
-              <w:t xml:space="preserve">copperstate</w:t>
-            </w:r>
-          </w:p>
-        </w:tc>
-        <w:tc>
-          <w:tcPr>
-            <w:tcW w:w="3430" w:type="dxa"/>
-            <w:tcMar>
-              <w:top w:w="120" w:type="dxa"/>
-              <w:left w:w="180" w:type="dxa"/>
-              <w:bottom w:w="120" w:type="dxa"/>
-              <w:right w:w="180" w:type="dxa"/>
-            </w:tcMar>
-          </w:tcPr>
-          <w:p>
-            <w:pPr>
-              <w:spacing w:after="0"/>
-            </w:pPr>
-            <w:r>
-              <w:t xml:space="preserve">Lab credential — set non-temporary; change in production</w:t>
+            <w:r>
+              <w:t>Admin password</w:t>
+            </w:r>
+          </w:p>
+        </w:tc>
+        <w:tc>
+          <w:tcPr>
+            <w:tcW w:w="3430" w:type="dxa"/>
+            <w:tcMar>
+              <w:top w:w="120" w:type="dxa"/>
+              <w:left w:w="180" w:type="dxa"/>
+              <w:bottom w:w="120" w:type="dxa"/>
+              <w:right w:w="180" w:type="dxa"/>
+            </w:tcMar>
+          </w:tcPr>
+          <w:p>
+            <w:r>
+              <w:t>copperstate</w:t>
+            </w:r>
+          </w:p>
+        </w:tc>
+        <w:tc>
+          <w:tcPr>
+            <w:tcW w:w="3430" w:type="dxa"/>
+            <w:tcMar>
+              <w:top w:w="120" w:type="dxa"/>
+              <w:left w:w="180" w:type="dxa"/>
+              <w:bottom w:w="120" w:type="dxa"/>
+              <w:right w:w="180" w:type="dxa"/>
+            </w:tcMar>
+          </w:tcPr>
+          <w:p>
+            <w:r>
+              <w:t>Lab credential — set non-temporary; change in production</w:t>
             </w:r>
           </w:p>
         </w:tc>
@@ -1494,10 +1459,56 @@
     </w:p>
     <w:p>
       <w:pPr>
+        <w:spacing w:after="120"/>
+      </w:pPr>
+    </w:p>
+    <w:p>
+      <w:pPr>
+        <w:spacing w:after="120"/>
+      </w:pPr>
+    </w:p>
+    <w:p>
+      <w:pPr>
+        <w:spacing w:after="120"/>
+      </w:pPr>
+    </w:p>
+    <w:p>
+      <w:pPr>
+        <w:spacing w:after="120"/>
+      </w:pPr>
+    </w:p>
+    <w:p>
+      <w:pPr>
+        <w:spacing w:after="120"/>
+      </w:pPr>
+    </w:p>
+    <w:p>
+      <w:pPr>
+        <w:spacing w:after="120"/>
+      </w:pPr>
+    </w:p>
+    <w:p>
+      <w:pPr>
+        <w:spacing w:after="120"/>
+      </w:pPr>
+    </w:p>
+    <w:p>
+      <w:pPr>
+        <w:spacing w:after="120"/>
+      </w:pPr>
+    </w:p>
+    <w:p>
+      <w:pPr>
+        <w:spacing w:after="120"/>
+      </w:pPr>
+    </w:p>
+    <w:p>
+      <w:pPr>
         <w:pStyle w:val="Heading1"/>
       </w:pPr>
       <w:r>
-        <w:t xml:space="preserve">The CSCU roster — all seven PDC roles covered</w:t>
+        <w:lastRenderedPageBreak/>
+        <w:t>The CSCU roster — all seven PDC roles covered</w:t>
       </w:r>
     </w:p>
     <w:p>
@@ -1512,7 +1523,7 @@
           <w:b/>
           <w:bCs/>
         </w:rPr>
-        <w:t xml:space="preserve">one</w:t>
+        <w:t>one</w:t>
       </w:r>
       <w:r>
         <w:t xml:space="preserve"> Data Steward.</w:t>
@@ -1529,6 +1540,7 @@
           <w:insideH w:val="single" w:sz="4" w:space="0" w:color="C9DEE8"/>
           <w:insideV w:val="single" w:sz="4" w:space="0" w:color="C9DEE8"/>
         </w:tblBorders>
+        <w:tblLook w:val="04A0" w:firstRow="1" w:lastRow="0" w:firstColumn="1" w:lastColumn="0" w:noHBand="0" w:noVBand="1"/>
       </w:tblPr>
       <w:tblGrid>
         <w:gridCol w:w="2500"/>
@@ -1539,27 +1551,24 @@
         <w:tc>
           <w:tcPr>
             <w:tcW w:w="2500" w:type="dxa"/>
-            <w:shd w:val="clear" w:color="auto" w:fill="EEF6FA"/>
             <w:tcBorders>
               <w:left w:val="single" w:sz="12" w:space="0" w:color="065A82"/>
             </w:tcBorders>
-            <w:tcMar>
-              <w:top w:w="120" w:type="dxa"/>
-              <w:left w:w="180" w:type="dxa"/>
-              <w:bottom w:w="120" w:type="dxa"/>
-              <w:right w:w="180" w:type="dxa"/>
-            </w:tcMar>
-          </w:tcPr>
-          <w:p>
-            <w:pPr>
-              <w:spacing w:after="0"/>
-            </w:pPr>
+            <w:shd w:val="clear" w:color="auto" w:fill="EEF6FA"/>
+            <w:tcMar>
+              <w:top w:w="120" w:type="dxa"/>
+              <w:left w:w="180" w:type="dxa"/>
+              <w:bottom w:w="120" w:type="dxa"/>
+              <w:right w:w="180" w:type="dxa"/>
+            </w:tcMar>
+          </w:tcPr>
+          <w:p>
             <w:r>
               <w:rPr>
                 <w:b/>
                 <w:bCs/>
               </w:rPr>
-              <w:t xml:space="preserve">User</w:t>
+              <w:t>User</w:t>
             </w:r>
           </w:p>
         </w:tc>
@@ -1575,15 +1584,12 @@
             </w:tcMar>
           </w:tcPr>
           <w:p>
-            <w:pPr>
-              <w:spacing w:after="0"/>
-            </w:pPr>
             <w:r>
               <w:rPr>
                 <w:b/>
                 <w:bCs/>
               </w:rPr>
-              <w:t xml:space="preserve">PDC role(s)</w:t>
+              <w:t>PDC role(s)</w:t>
             </w:r>
           </w:p>
         </w:tc>
@@ -1599,15 +1605,12 @@
             </w:tcMar>
           </w:tcPr>
           <w:p>
-            <w:pPr>
-              <w:spacing w:after="0"/>
-            </w:pPr>
             <w:r>
               <w:rPr>
                 <w:b/>
                 <w:bCs/>
               </w:rPr>
-              <w:t xml:space="preserve">Why</w:t>
+              <w:t>Why</w:t>
             </w:r>
           </w:p>
         </w:tc>
@@ -1624,47 +1627,38 @@
             </w:tcMar>
           </w:tcPr>
           <w:p>
-            <w:pPr>
-              <w:spacing w:after="0"/>
-            </w:pPr>
-            <w:r>
-              <w:t xml:space="preserve">catalog.admin</w:t>
-            </w:r>
-          </w:p>
-        </w:tc>
-        <w:tc>
-          <w:tcPr>
-            <w:tcW w:w="3430" w:type="dxa"/>
-            <w:tcMar>
-              <w:top w:w="120" w:type="dxa"/>
-              <w:left w:w="180" w:type="dxa"/>
-              <w:bottom w:w="120" w:type="dxa"/>
-              <w:right w:w="180" w:type="dxa"/>
-            </w:tcMar>
-          </w:tcPr>
-          <w:p>
-            <w:pPr>
-              <w:spacing w:after="0"/>
-            </w:pPr>
-            <w:r>
-              <w:t xml:space="preserve">ALL SEVEN ROLES</w:t>
-            </w:r>
-          </w:p>
-        </w:tc>
-        <w:tc>
-          <w:tcPr>
-            <w:tcW w:w="3430" w:type="dxa"/>
-            <w:tcMar>
-              <w:top w:w="120" w:type="dxa"/>
-              <w:left w:w="180" w:type="dxa"/>
-              <w:bottom w:w="120" w:type="dxa"/>
-              <w:right w:w="180" w:type="dxa"/>
-            </w:tcMar>
-          </w:tcPr>
-          <w:p>
-            <w:pPr>
-              <w:spacing w:after="0"/>
-            </w:pPr>
+            <w:r>
+              <w:t>catalog.admin</w:t>
+            </w:r>
+          </w:p>
+        </w:tc>
+        <w:tc>
+          <w:tcPr>
+            <w:tcW w:w="3430" w:type="dxa"/>
+            <w:tcMar>
+              <w:top w:w="120" w:type="dxa"/>
+              <w:left w:w="180" w:type="dxa"/>
+              <w:bottom w:w="120" w:type="dxa"/>
+              <w:right w:w="180" w:type="dxa"/>
+            </w:tcMar>
+          </w:tcPr>
+          <w:p>
+            <w:r>
+              <w:t>ALL SEVEN ROLES</w:t>
+            </w:r>
+          </w:p>
+        </w:tc>
+        <w:tc>
+          <w:tcPr>
+            <w:tcW w:w="3430" w:type="dxa"/>
+            <w:tcMar>
+              <w:top w:w="120" w:type="dxa"/>
+              <w:left w:w="180" w:type="dxa"/>
+              <w:bottom w:w="120" w:type="dxa"/>
+              <w:right w:w="180" w:type="dxa"/>
+            </w:tcMar>
+          </w:tcPr>
+          <w:p>
             <w:r>
               <w:t xml:space="preserve">Course superuser / trainer. Password reset in Keycloak to </w:t>
             </w:r>
@@ -1675,7 +1669,7 @@
                 <w:sz w:val="20"/>
                 <w:szCs w:val="20"/>
               </w:rPr>
-              <w:t xml:space="preserve">copperstate</w:t>
+              <w:t>copperstate</w:t>
             </w:r>
           </w:p>
         </w:tc>
@@ -1692,49 +1686,40 @@
             </w:tcMar>
           </w:tcPr>
           <w:p>
-            <w:pPr>
-              <w:spacing w:after="0"/>
-            </w:pPr>
-            <w:r>
-              <w:t xml:space="preserve">elena.ramirez</w:t>
-            </w:r>
-          </w:p>
-        </w:tc>
-        <w:tc>
-          <w:tcPr>
-            <w:tcW w:w="3430" w:type="dxa"/>
-            <w:tcMar>
-              <w:top w:w="120" w:type="dxa"/>
-              <w:left w:w="180" w:type="dxa"/>
-              <w:bottom w:w="120" w:type="dxa"/>
-              <w:right w:w="180" w:type="dxa"/>
-            </w:tcMar>
-          </w:tcPr>
-          <w:p>
-            <w:pPr>
-              <w:spacing w:after="0"/>
-            </w:pPr>
-            <w:r>
-              <w:t xml:space="preserve">Data Steward · Business Steward</w:t>
-            </w:r>
-          </w:p>
-        </w:tc>
-        <w:tc>
-          <w:tcPr>
-            <w:tcW w:w="3430" w:type="dxa"/>
-            <w:tcMar>
-              <w:top w:w="120" w:type="dxa"/>
-              <w:left w:w="180" w:type="dxa"/>
-              <w:bottom w:w="120" w:type="dxa"/>
-              <w:right w:w="180" w:type="dxa"/>
-            </w:tcMar>
-          </w:tcPr>
-          <w:p>
-            <w:pPr>
-              <w:spacing w:after="0"/>
-            </w:pPr>
-            <w:r>
-              <w:t xml:space="preserve">The single Data Steward: connects sources, profiles, runs identification; stewards Member, Accounts &amp; Deposits, Transactions, Branch Operations</w:t>
+            <w:r>
+              <w:t>elena.ramirez</w:t>
+            </w:r>
+          </w:p>
+        </w:tc>
+        <w:tc>
+          <w:tcPr>
+            <w:tcW w:w="3430" w:type="dxa"/>
+            <w:tcMar>
+              <w:top w:w="120" w:type="dxa"/>
+              <w:left w:w="180" w:type="dxa"/>
+              <w:bottom w:w="120" w:type="dxa"/>
+              <w:right w:w="180" w:type="dxa"/>
+            </w:tcMar>
+          </w:tcPr>
+          <w:p>
+            <w:r>
+              <w:t>Data Steward · Business Steward</w:t>
+            </w:r>
+          </w:p>
+        </w:tc>
+        <w:tc>
+          <w:tcPr>
+            <w:tcW w:w="3430" w:type="dxa"/>
+            <w:tcMar>
+              <w:top w:w="120" w:type="dxa"/>
+              <w:left w:w="180" w:type="dxa"/>
+              <w:bottom w:w="120" w:type="dxa"/>
+              <w:right w:w="180" w:type="dxa"/>
+            </w:tcMar>
+          </w:tcPr>
+          <w:p>
+            <w:r>
+              <w:t>The single Data Steward: connects sources, profiles, runs identification; stewards Member, Accounts &amp; Deposits, Transactions, Branch Operations</w:t>
             </w:r>
           </w:p>
         </w:tc>
@@ -1751,49 +1736,40 @@
             </w:tcMar>
           </w:tcPr>
           <w:p>
-            <w:pPr>
-              <w:spacing w:after="0"/>
-            </w:pPr>
-            <w:r>
-              <w:t xml:space="preserve">marcus.webb</w:t>
-            </w:r>
-          </w:p>
-        </w:tc>
-        <w:tc>
-          <w:tcPr>
-            <w:tcW w:w="3430" w:type="dxa"/>
-            <w:tcMar>
-              <w:top w:w="120" w:type="dxa"/>
-              <w:left w:w="180" w:type="dxa"/>
-              <w:bottom w:w="120" w:type="dxa"/>
-              <w:right w:w="180" w:type="dxa"/>
-            </w:tcMar>
-          </w:tcPr>
-          <w:p>
-            <w:pPr>
-              <w:spacing w:after="0"/>
-            </w:pPr>
-            <w:r>
-              <w:t xml:space="preserve">Business Steward</w:t>
-            </w:r>
-          </w:p>
-        </w:tc>
-        <w:tc>
-          <w:tcPr>
-            <w:tcW w:w="3430" w:type="dxa"/>
-            <w:tcMar>
-              <w:top w:w="120" w:type="dxa"/>
-              <w:left w:w="180" w:type="dxa"/>
-              <w:bottom w:w="120" w:type="dxa"/>
-              <w:right w:w="180" w:type="dxa"/>
-            </w:tcMar>
-          </w:tcPr>
-          <w:p>
-            <w:pPr>
-              <w:spacing w:after="0"/>
-            </w:pPr>
-            <w:r>
-              <w:t xml:space="preserve">Stewards Lending and Finance &amp; Ledger terms (Loan Number, APR, GL Account)</w:t>
+            <w:r>
+              <w:t>marcus.webb</w:t>
+            </w:r>
+          </w:p>
+        </w:tc>
+        <w:tc>
+          <w:tcPr>
+            <w:tcW w:w="3430" w:type="dxa"/>
+            <w:tcMar>
+              <w:top w:w="120" w:type="dxa"/>
+              <w:left w:w="180" w:type="dxa"/>
+              <w:bottom w:w="120" w:type="dxa"/>
+              <w:right w:w="180" w:type="dxa"/>
+            </w:tcMar>
+          </w:tcPr>
+          <w:p>
+            <w:r>
+              <w:t>Business Steward</w:t>
+            </w:r>
+          </w:p>
+        </w:tc>
+        <w:tc>
+          <w:tcPr>
+            <w:tcW w:w="3430" w:type="dxa"/>
+            <w:tcMar>
+              <w:top w:w="120" w:type="dxa"/>
+              <w:left w:w="180" w:type="dxa"/>
+              <w:bottom w:w="120" w:type="dxa"/>
+              <w:right w:w="180" w:type="dxa"/>
+            </w:tcMar>
+          </w:tcPr>
+          <w:p>
+            <w:r>
+              <w:t>Stewards Lending and Finance &amp; Ledger terms (Loan Number, APR, GL Account)</w:t>
             </w:r>
           </w:p>
         </w:tc>
@@ -1810,49 +1786,40 @@
             </w:tcMar>
           </w:tcPr>
           <w:p>
-            <w:pPr>
-              <w:spacing w:after="0"/>
-            </w:pPr>
-            <w:r>
-              <w:t xml:space="preserve">nadia.flores</w:t>
-            </w:r>
-          </w:p>
-        </w:tc>
-        <w:tc>
-          <w:tcPr>
-            <w:tcW w:w="3430" w:type="dxa"/>
-            <w:tcMar>
-              <w:top w:w="120" w:type="dxa"/>
-              <w:left w:w="180" w:type="dxa"/>
-              <w:bottom w:w="120" w:type="dxa"/>
-              <w:right w:w="180" w:type="dxa"/>
-            </w:tcMar>
-          </w:tcPr>
-          <w:p>
-            <w:pPr>
-              <w:spacing w:after="0"/>
-            </w:pPr>
-            <w:r>
-              <w:t xml:space="preserve">Business Steward</w:t>
-            </w:r>
-          </w:p>
-        </w:tc>
-        <w:tc>
-          <w:tcPr>
-            <w:tcW w:w="3430" w:type="dxa"/>
-            <w:tcMar>
-              <w:top w:w="120" w:type="dxa"/>
-              <w:left w:w="180" w:type="dxa"/>
-              <w:bottom w:w="120" w:type="dxa"/>
-              <w:right w:w="180" w:type="dxa"/>
-            </w:tcMar>
-          </w:tcPr>
-          <w:p>
-            <w:pPr>
-              <w:spacing w:after="0"/>
-            </w:pPr>
-            <w:r>
-              <w:t xml:space="preserve">BSA/AML officer; stewards Compliance &amp; Risk (all CDE) and Records &amp; Documents</w:t>
+            <w:r>
+              <w:t>nadia.flores</w:t>
+            </w:r>
+          </w:p>
+        </w:tc>
+        <w:tc>
+          <w:tcPr>
+            <w:tcW w:w="3430" w:type="dxa"/>
+            <w:tcMar>
+              <w:top w:w="120" w:type="dxa"/>
+              <w:left w:w="180" w:type="dxa"/>
+              <w:bottom w:w="120" w:type="dxa"/>
+              <w:right w:w="180" w:type="dxa"/>
+            </w:tcMar>
+          </w:tcPr>
+          <w:p>
+            <w:r>
+              <w:t>Business Steward</w:t>
+            </w:r>
+          </w:p>
+        </w:tc>
+        <w:tc>
+          <w:tcPr>
+            <w:tcW w:w="3430" w:type="dxa"/>
+            <w:tcMar>
+              <w:top w:w="120" w:type="dxa"/>
+              <w:left w:w="180" w:type="dxa"/>
+              <w:bottom w:w="120" w:type="dxa"/>
+              <w:right w:w="180" w:type="dxa"/>
+            </w:tcMar>
+          </w:tcPr>
+          <w:p>
+            <w:r>
+              <w:t>BSA/AML officer; stewards Compliance &amp; Risk (all CDE) and Records &amp; Documents</w:t>
             </w:r>
           </w:p>
         </w:tc>
@@ -1869,49 +1836,40 @@
             </w:tcMar>
           </w:tcPr>
           <w:p>
-            <w:pPr>
-              <w:spacing w:after="0"/>
-            </w:pPr>
-            <w:r>
-              <w:t xml:space="preserve">tom.callahan</w:t>
-            </w:r>
-          </w:p>
-        </w:tc>
-        <w:tc>
-          <w:tcPr>
-            <w:tcW w:w="3430" w:type="dxa"/>
-            <w:tcMar>
-              <w:top w:w="120" w:type="dxa"/>
-              <w:left w:w="180" w:type="dxa"/>
-              <w:bottom w:w="120" w:type="dxa"/>
-              <w:right w:w="180" w:type="dxa"/>
-            </w:tcMar>
-          </w:tcPr>
-          <w:p>
-            <w:pPr>
-              <w:spacing w:after="0"/>
-            </w:pPr>
-            <w:r>
-              <w:t xml:space="preserve">Business Steward</w:t>
-            </w:r>
-          </w:p>
-        </w:tc>
-        <w:tc>
-          <w:tcPr>
-            <w:tcW w:w="3430" w:type="dxa"/>
-            <w:tcMar>
-              <w:top w:w="120" w:type="dxa"/>
-              <w:left w:w="180" w:type="dxa"/>
-              <w:bottom w:w="120" w:type="dxa"/>
-              <w:right w:w="180" w:type="dxa"/>
-            </w:tcMar>
-          </w:tcPr>
-          <w:p>
-            <w:pPr>
-              <w:spacing w:after="0"/>
-            </w:pPr>
-            <w:r>
-              <w:t xml:space="preserve">Stewards Cards &amp; Payments terms (Card Number, Routing Number)</w:t>
+            <w:r>
+              <w:t>tom.callahan</w:t>
+            </w:r>
+          </w:p>
+        </w:tc>
+        <w:tc>
+          <w:tcPr>
+            <w:tcW w:w="3430" w:type="dxa"/>
+            <w:tcMar>
+              <w:top w:w="120" w:type="dxa"/>
+              <w:left w:w="180" w:type="dxa"/>
+              <w:bottom w:w="120" w:type="dxa"/>
+              <w:right w:w="180" w:type="dxa"/>
+            </w:tcMar>
+          </w:tcPr>
+          <w:p>
+            <w:r>
+              <w:t>Business Steward</w:t>
+            </w:r>
+          </w:p>
+        </w:tc>
+        <w:tc>
+          <w:tcPr>
+            <w:tcW w:w="3430" w:type="dxa"/>
+            <w:tcMar>
+              <w:top w:w="120" w:type="dxa"/>
+              <w:left w:w="180" w:type="dxa"/>
+              <w:bottom w:w="120" w:type="dxa"/>
+              <w:right w:w="180" w:type="dxa"/>
+            </w:tcMar>
+          </w:tcPr>
+          <w:p>
+            <w:r>
+              <w:t>Stewards Cards &amp; Payments terms (Card Number, Routing Number)</w:t>
             </w:r>
           </w:p>
         </w:tc>
@@ -1928,49 +1886,40 @@
             </w:tcMar>
           </w:tcPr>
           <w:p>
-            <w:pPr>
-              <w:spacing w:after="0"/>
-            </w:pPr>
-            <w:r>
-              <w:t xml:space="preserve">omar.haddad</w:t>
-            </w:r>
-          </w:p>
-        </w:tc>
-        <w:tc>
-          <w:tcPr>
-            <w:tcW w:w="3430" w:type="dxa"/>
-            <w:tcMar>
-              <w:top w:w="120" w:type="dxa"/>
-              <w:left w:w="180" w:type="dxa"/>
-              <w:bottom w:w="120" w:type="dxa"/>
-              <w:right w:w="180" w:type="dxa"/>
-            </w:tcMar>
-          </w:tcPr>
-          <w:p>
-            <w:pPr>
-              <w:spacing w:after="0"/>
-            </w:pPr>
-            <w:r>
-              <w:t xml:space="preserve">Data Storage Administrator</w:t>
-            </w:r>
-          </w:p>
-        </w:tc>
-        <w:tc>
-          <w:tcPr>
-            <w:tcW w:w="3430" w:type="dxa"/>
-            <w:tcMar>
-              <w:top w:w="120" w:type="dxa"/>
-              <w:left w:w="180" w:type="dxa"/>
-              <w:bottom w:w="120" w:type="dxa"/>
-              <w:right w:w="180" w:type="dxa"/>
-            </w:tcMar>
-          </w:tcPr>
-          <w:p>
-            <w:pPr>
-              <w:spacing w:after="0"/>
-            </w:pPr>
-            <w:r>
-              <w:t xml:space="preserve">Storage custodian: creates/ingests data sources, monitors utilisation; fills the app's custodian slot</w:t>
+            <w:r>
+              <w:t>omar.haddad</w:t>
+            </w:r>
+          </w:p>
+        </w:tc>
+        <w:tc>
+          <w:tcPr>
+            <w:tcW w:w="3430" w:type="dxa"/>
+            <w:tcMar>
+              <w:top w:w="120" w:type="dxa"/>
+              <w:left w:w="180" w:type="dxa"/>
+              <w:bottom w:w="120" w:type="dxa"/>
+              <w:right w:w="180" w:type="dxa"/>
+            </w:tcMar>
+          </w:tcPr>
+          <w:p>
+            <w:r>
+              <w:t>Data Storage Administrator</w:t>
+            </w:r>
+          </w:p>
+        </w:tc>
+        <w:tc>
+          <w:tcPr>
+            <w:tcW w:w="3430" w:type="dxa"/>
+            <w:tcMar>
+              <w:top w:w="120" w:type="dxa"/>
+              <w:left w:w="180" w:type="dxa"/>
+              <w:bottom w:w="120" w:type="dxa"/>
+              <w:right w:w="180" w:type="dxa"/>
+            </w:tcMar>
+          </w:tcPr>
+          <w:p>
+            <w:r>
+              <w:t>Storage custodian: creates/ingests data sources, monitors utilisation; fills the app's custodian slot</w:t>
             </w:r>
           </w:p>
         </w:tc>
@@ -1987,49 +1936,40 @@
             </w:tcMar>
           </w:tcPr>
           <w:p>
-            <w:pPr>
-              <w:spacing w:after="0"/>
-            </w:pPr>
-            <w:r>
-              <w:t xml:space="preserve">dana.ortiz</w:t>
-            </w:r>
-          </w:p>
-        </w:tc>
-        <w:tc>
-          <w:tcPr>
-            <w:tcW w:w="3430" w:type="dxa"/>
-            <w:tcMar>
-              <w:top w:w="120" w:type="dxa"/>
-              <w:left w:w="180" w:type="dxa"/>
-              <w:bottom w:w="120" w:type="dxa"/>
-              <w:right w:w="180" w:type="dxa"/>
-            </w:tcMar>
-          </w:tcPr>
-          <w:p>
-            <w:pPr>
-              <w:spacing w:after="0"/>
-            </w:pPr>
-            <w:r>
-              <w:t xml:space="preserve">Data Developer</w:t>
-            </w:r>
-          </w:p>
-        </w:tc>
-        <w:tc>
-          <w:tcPr>
-            <w:tcW w:w="3430" w:type="dxa"/>
-            <w:tcMar>
-              <w:top w:w="120" w:type="dxa"/>
-              <w:left w:w="180" w:type="dxa"/>
-              <w:bottom w:w="120" w:type="dxa"/>
-              <w:right w:w="180" w:type="dxa"/>
-            </w:tcMar>
-          </w:tcPr>
-          <w:p>
-            <w:pPr>
-              <w:spacing w:after="0"/>
-            </w:pPr>
-            <w:r>
-              <w:t xml:space="preserve">Authors the Workshop 4 business rules and domain logic (this role owns Business Rules — Admin cannot create them)</w:t>
+            <w:r>
+              <w:t>dana.ortiz</w:t>
+            </w:r>
+          </w:p>
+        </w:tc>
+        <w:tc>
+          <w:tcPr>
+            <w:tcW w:w="3430" w:type="dxa"/>
+            <w:tcMar>
+              <w:top w:w="120" w:type="dxa"/>
+              <w:left w:w="180" w:type="dxa"/>
+              <w:bottom w:w="120" w:type="dxa"/>
+              <w:right w:w="180" w:type="dxa"/>
+            </w:tcMar>
+          </w:tcPr>
+          <w:p>
+            <w:r>
+              <w:t>Data Developer</w:t>
+            </w:r>
+          </w:p>
+        </w:tc>
+        <w:tc>
+          <w:tcPr>
+            <w:tcW w:w="3430" w:type="dxa"/>
+            <w:tcMar>
+              <w:top w:w="120" w:type="dxa"/>
+              <w:left w:w="180" w:type="dxa"/>
+              <w:bottom w:w="120" w:type="dxa"/>
+              <w:right w:w="180" w:type="dxa"/>
+            </w:tcMar>
+          </w:tcPr>
+          <w:p>
+            <w:r>
+              <w:t>Authors the Workshop 4 business rules and domain logic (this role owns Business Rules — Admin cannot create them)</w:t>
             </w:r>
           </w:p>
         </w:tc>
@@ -2046,49 +1986,40 @@
             </w:tcMar>
           </w:tcPr>
           <w:p>
-            <w:pPr>
-              <w:spacing w:after="0"/>
-            </w:pPr>
-            <w:r>
-              <w:t xml:space="preserve">jordan.blake</w:t>
-            </w:r>
-          </w:p>
-        </w:tc>
-        <w:tc>
-          <w:tcPr>
-            <w:tcW w:w="3430" w:type="dxa"/>
-            <w:tcMar>
-              <w:top w:w="120" w:type="dxa"/>
-              <w:left w:w="180" w:type="dxa"/>
-              <w:bottom w:w="120" w:type="dxa"/>
-              <w:right w:w="180" w:type="dxa"/>
-            </w:tcMar>
-          </w:tcPr>
-          <w:p>
-            <w:pPr>
-              <w:spacing w:after="0"/>
-            </w:pPr>
-            <w:r>
-              <w:t xml:space="preserve">Data User</w:t>
-            </w:r>
-          </w:p>
-        </w:tc>
-        <w:tc>
-          <w:tcPr>
-            <w:tcW w:w="3430" w:type="dxa"/>
-            <w:tcMar>
-              <w:top w:w="120" w:type="dxa"/>
-              <w:left w:w="180" w:type="dxa"/>
-              <w:bottom w:w="120" w:type="dxa"/>
-              <w:right w:w="180" w:type="dxa"/>
-            </w:tcMar>
-          </w:tcPr>
-          <w:p>
-            <w:pPr>
-              <w:spacing w:after="0"/>
-            </w:pPr>
-            <w:r>
-              <w:t xml:space="preserve">Business Analyst persona — reads, searches, views data assets</w:t>
+            <w:r>
+              <w:t>jordan.blake</w:t>
+            </w:r>
+          </w:p>
+        </w:tc>
+        <w:tc>
+          <w:tcPr>
+            <w:tcW w:w="3430" w:type="dxa"/>
+            <w:tcMar>
+              <w:top w:w="120" w:type="dxa"/>
+              <w:left w:w="180" w:type="dxa"/>
+              <w:bottom w:w="120" w:type="dxa"/>
+              <w:right w:w="180" w:type="dxa"/>
+            </w:tcMar>
+          </w:tcPr>
+          <w:p>
+            <w:r>
+              <w:t>Data User</w:t>
+            </w:r>
+          </w:p>
+        </w:tc>
+        <w:tc>
+          <w:tcPr>
+            <w:tcW w:w="3430" w:type="dxa"/>
+            <w:tcMar>
+              <w:top w:w="120" w:type="dxa"/>
+              <w:left w:w="180" w:type="dxa"/>
+              <w:bottom w:w="120" w:type="dxa"/>
+              <w:right w:w="180" w:type="dxa"/>
+            </w:tcMar>
+          </w:tcPr>
+          <w:p>
+            <w:r>
+              <w:t>Business Analyst persona — reads, searches, views data assets</w:t>
             </w:r>
           </w:p>
         </w:tc>
@@ -2105,49 +2036,40 @@
             </w:tcMar>
           </w:tcPr>
           <w:p>
-            <w:pPr>
-              <w:spacing w:after="0"/>
-            </w:pPr>
-            <w:r>
-              <w:t xml:space="preserve">riley.morgan</w:t>
-            </w:r>
-          </w:p>
-        </w:tc>
-        <w:tc>
-          <w:tcPr>
-            <w:tcW w:w="3430" w:type="dxa"/>
-            <w:tcMar>
-              <w:top w:w="120" w:type="dxa"/>
-              <w:left w:w="180" w:type="dxa"/>
-              <w:bottom w:w="120" w:type="dxa"/>
-              <w:right w:w="180" w:type="dxa"/>
-            </w:tcMar>
-          </w:tcPr>
-          <w:p>
-            <w:pPr>
-              <w:spacing w:after="0"/>
-            </w:pPr>
-            <w:r>
-              <w:t xml:space="preserve">Business User</w:t>
-            </w:r>
-          </w:p>
-        </w:tc>
-        <w:tc>
-          <w:tcPr>
-            <w:tcW w:w="3430" w:type="dxa"/>
-            <w:tcMar>
-              <w:top w:w="120" w:type="dxa"/>
-              <w:left w:w="180" w:type="dxa"/>
-              <w:bottom w:w="120" w:type="dxa"/>
-              <w:right w:w="180" w:type="dxa"/>
-            </w:tcMar>
-          </w:tcPr>
-          <w:p>
-            <w:pPr>
-              <w:spacing w:after="0"/>
-            </w:pPr>
-            <w:r>
-              <w:t xml:space="preserve">Lightest tier: views the glossary and policies only — the contrast case to Jordan</w:t>
+            <w:r>
+              <w:t>riley.morgan</w:t>
+            </w:r>
+          </w:p>
+        </w:tc>
+        <w:tc>
+          <w:tcPr>
+            <w:tcW w:w="3430" w:type="dxa"/>
+            <w:tcMar>
+              <w:top w:w="120" w:type="dxa"/>
+              <w:left w:w="180" w:type="dxa"/>
+              <w:bottom w:w="120" w:type="dxa"/>
+              <w:right w:w="180" w:type="dxa"/>
+            </w:tcMar>
+          </w:tcPr>
+          <w:p>
+            <w:r>
+              <w:t>Business User</w:t>
+            </w:r>
+          </w:p>
+        </w:tc>
+        <w:tc>
+          <w:tcPr>
+            <w:tcW w:w="3430" w:type="dxa"/>
+            <w:tcMar>
+              <w:top w:w="120" w:type="dxa"/>
+              <w:left w:w="180" w:type="dxa"/>
+              <w:bottom w:w="120" w:type="dxa"/>
+              <w:right w:w="180" w:type="dxa"/>
+            </w:tcMar>
+          </w:tcPr>
+          <w:p>
+            <w:r>
+              <w:t>Lightest tier: views the glossary and policies only — the contrast case to Jordan</w:t>
             </w:r>
           </w:p>
         </w:tc>
@@ -2164,15 +2086,16 @@
           <w:left w:val="single" w:sz="12" w:space="8" w:color="065A82"/>
         </w:pBdr>
         <w:shd w:val="clear" w:color="auto" w:fill="EEF6FA"/>
+        <w:spacing w:before="120" w:after="160"/>
         <w:ind w:left="240" w:right="240"/>
-        <w:spacing w:before="120" w:after="160"/>
       </w:pPr>
       <w:r>
         <w:rPr>
           <w:b/>
           <w:bCs/>
         </w:rPr>
-        <w:t xml:space="preserve">Licence note:</w:t>
+        <w:lastRenderedPageBreak/>
+        <w:t>Licence note:</w:t>
       </w:r>
       <w:r>
         <w:t xml:space="preserve"> the Expert-tier roles count against your licensed Expert-user limit — this roster uses seven Expert accounts.</w:t>
@@ -2184,15 +2107,15 @@
           <w:left w:val="single" w:sz="12" w:space="8" w:color="065A82"/>
         </w:pBdr>
         <w:shd w:val="clear" w:color="auto" w:fill="EEF6FA"/>
+        <w:spacing w:before="120" w:after="160"/>
         <w:ind w:left="240" w:right="240"/>
-        <w:spacing w:before="120" w:after="160"/>
       </w:pPr>
       <w:r>
         <w:rPr>
           <w:b/>
           <w:bCs/>
         </w:rPr>
-        <w:t xml:space="preserve">Expertise drives governance.</w:t>
+        <w:t>Expertise drives governance.</w:t>
       </w:r>
       <w:r>
         <w:t xml:space="preserve"> Each steward's roster entry carries expertise keywords (see </w:t>
@@ -2204,10 +2127,10 @@
           <w:sz w:val="20"/>
           <w:szCs w:val="20"/>
         </w:rPr>
-        <w:t xml:space="preserve">data_sources/CSCU/domain_pack/credit_union.people.json</w:t>
-      </w:r>
-      <w:r>
-        <w:t xml:space="preserve">); the Glossary Generator's Govern page matches them against category, term and column names to auto-assign the steward / owner / custodian slots. The four Business Stewards' keywords deliberately cover all nine glossary categories.</w:t>
+        <w:t>data_sources/CSCU/domain_pack/credit_union.people.json</w:t>
+      </w:r>
+      <w:r>
+        <w:t>); the Glossary Generator's Govern page matches them against category, term and column names to auto-assign the steward / owner / custodian slots. The four Business Stewards' keywords deliberately cover all nine glossary categories.</w:t>
       </w:r>
     </w:p>
     <w:p>
@@ -2215,7 +2138,7 @@
         <w:pStyle w:val="Heading1"/>
       </w:pPr>
       <w:r>
-        <w:t xml:space="preserve">Step-by-step</w:t>
+        <w:t>Step-by-step</w:t>
       </w:r>
     </w:p>
     <w:p>
@@ -2223,7 +2146,7 @@
         <w:pStyle w:val="Heading2"/>
       </w:pPr>
       <w:r>
-        <w:t xml:space="preserve">Part A — Reset the catalog administrator (Keycloak)</w:t>
+        <w:t>Part A — Reset the catalog administrator (Keycloak)</w:t>
       </w:r>
     </w:p>
     <w:p>
@@ -2231,7 +2154,7 @@
         <w:pStyle w:val="ListParagraph"/>
         <w:numPr>
           <w:ilvl w:val="0"/>
-          <w:numId w:val="100"/>
+          <w:numId w:val="7"/>
         </w:numPr>
         <w:spacing w:after="80" w:line="264" w:lineRule="auto"/>
       </w:pPr>
@@ -2245,7 +2168,7 @@
           <w:sz w:val="20"/>
           <w:szCs w:val="20"/>
         </w:rPr>
-        <w:t xml:space="preserve">https://pentaho.io/keycloak</w:t>
+        <w:t>https://pentaho.io/keycloak</w:t>
       </w:r>
       <w:r>
         <w:t xml:space="preserve"> and sign in with the Keycloak (master-realm) administrator credentials.</w:t>
@@ -2256,7 +2179,7 @@
         <w:pStyle w:val="ListParagraph"/>
         <w:numPr>
           <w:ilvl w:val="0"/>
-          <w:numId w:val="100"/>
+          <w:numId w:val="7"/>
         </w:numPr>
         <w:spacing w:after="80" w:line="264" w:lineRule="auto"/>
       </w:pPr>
@@ -2270,7 +2193,7 @@
           <w:sz w:val="20"/>
           <w:szCs w:val="20"/>
         </w:rPr>
-        <w:t xml:space="preserve">master</w:t>
+        <w:t>master</w:t>
       </w:r>
       <w:r>
         <w:t xml:space="preserve"> to the </w:t>
@@ -2280,7 +2203,7 @@
           <w:b/>
           <w:bCs/>
         </w:rPr>
-        <w:t xml:space="preserve">pdc</w:t>
+        <w:t>pdc</w:t>
       </w:r>
       <w:r>
         <w:t xml:space="preserve"> realm. Everything below happens in the pdc realm.</w:t>
@@ -2295,9 +2218,9 @@
           <w:right w:val="dashed" w:sz="8" w:space="6" w:color="C8A028"/>
         </w:pBdr>
         <w:shd w:val="clear" w:color="auto" w:fill="FFF7E0"/>
-        <w:jc w:val="center"/>
         <w:spacing w:before="120" w:after="200"/>
         <w:ind w:left="240" w:right="240"/>
+        <w:jc w:val="center"/>
       </w:pPr>
       <w:r>
         <w:rPr>
@@ -2305,7 +2228,7 @@
           <w:bCs/>
           <w:color w:val="8A6D1A"/>
         </w:rPr>
-        <w:t xml:space="preserve">📷  SCREENSHOT — Keycloak realm selector — pdc realm selected</w:t>
+        <w:t>📷  SCREENSHOT — Keycloak realm selector — pdc realm selected</w:t>
       </w:r>
     </w:p>
     <w:p>
@@ -2313,7 +2236,7 @@
         <w:pStyle w:val="ListParagraph"/>
         <w:numPr>
           <w:ilvl w:val="0"/>
-          <w:numId w:val="100"/>
+          <w:numId w:val="7"/>
         </w:numPr>
         <w:spacing w:after="80" w:line="264" w:lineRule="auto"/>
       </w:pPr>
@@ -2325,7 +2248,7 @@
           <w:b/>
           <w:bCs/>
         </w:rPr>
-        <w:t xml:space="preserve">Users</w:t>
+        <w:t>Users</w:t>
       </w:r>
       <w:r>
         <w:t xml:space="preserve">, search for </w:t>
@@ -2337,7 +2260,7 @@
           <w:sz w:val="20"/>
           <w:szCs w:val="20"/>
         </w:rPr>
-        <w:t xml:space="preserve">catalog.admin</w:t>
+        <w:t>catalog.admin</w:t>
       </w:r>
       <w:r>
         <w:t xml:space="preserve">, and open the account. If it does not exist yet, click </w:t>
@@ -2347,7 +2270,7 @@
           <w:b/>
           <w:bCs/>
         </w:rPr>
-        <w:t xml:space="preserve">Add user</w:t>
+        <w:t>Add user</w:t>
       </w:r>
       <w:r>
         <w:t xml:space="preserve">, set the username to </w:t>
@@ -2359,7 +2282,7 @@
           <w:sz w:val="20"/>
           <w:szCs w:val="20"/>
         </w:rPr>
-        <w:t xml:space="preserve">catalog.admin</w:t>
+        <w:t>catalog.admin</w:t>
       </w:r>
       <w:r>
         <w:t xml:space="preserve"> and email </w:t>
@@ -2371,10 +2294,10 @@
           <w:sz w:val="20"/>
           <w:szCs w:val="20"/>
         </w:rPr>
-        <w:t xml:space="preserve">catalog.admin@copperstatecu.org</w:t>
-      </w:r>
-      <w:r>
-        <w:t xml:space="preserve">, and save.</w:t>
+        <w:t>catalog.admin@copperstatecu.org</w:t>
+      </w:r>
+      <w:r>
+        <w:t>, and save.</w:t>
       </w:r>
     </w:p>
     <w:p>
@@ -2382,7 +2305,7 @@
         <w:pStyle w:val="ListParagraph"/>
         <w:numPr>
           <w:ilvl w:val="0"/>
-          <w:numId w:val="100"/>
+          <w:numId w:val="7"/>
         </w:numPr>
         <w:spacing w:after="80" w:line="264" w:lineRule="auto"/>
       </w:pPr>
@@ -2394,7 +2317,7 @@
           <w:b/>
           <w:bCs/>
         </w:rPr>
-        <w:t xml:space="preserve">Credentials</w:t>
+        <w:t>Credentials</w:t>
       </w:r>
       <w:r>
         <w:t xml:space="preserve"> tab, click </w:t>
@@ -2404,7 +2327,7 @@
           <w:b/>
           <w:bCs/>
         </w:rPr>
-        <w:t xml:space="preserve">Reset password</w:t>
+        <w:t>Reset password</w:t>
       </w:r>
       <w:r>
         <w:t xml:space="preserve">, enter </w:t>
@@ -2416,7 +2339,7 @@
           <w:sz w:val="20"/>
           <w:szCs w:val="20"/>
         </w:rPr>
-        <w:t xml:space="preserve">copperstate</w:t>
+        <w:t>copperstate</w:t>
       </w:r>
       <w:r>
         <w:t xml:space="preserve"> in both fields, and — importantly — turn </w:t>
@@ -2426,7 +2349,7 @@
           <w:b/>
           <w:bCs/>
         </w:rPr>
-        <w:t xml:space="preserve">Temporary off</w:t>
+        <w:t>Temporary off</w:t>
       </w:r>
       <w:r>
         <w:t xml:space="preserve"> so the password works immediately without a forced reset. Save.</w:t>
@@ -2441,9 +2364,9 @@
           <w:right w:val="dashed" w:sz="8" w:space="6" w:color="C8A028"/>
         </w:pBdr>
         <w:shd w:val="clear" w:color="auto" w:fill="FFF7E0"/>
-        <w:jc w:val="center"/>
         <w:spacing w:before="120" w:after="200"/>
         <w:ind w:left="240" w:right="240"/>
+        <w:jc w:val="center"/>
       </w:pPr>
       <w:r>
         <w:rPr>
@@ -2451,7 +2374,7 @@
           <w:bCs/>
           <w:color w:val="8A6D1A"/>
         </w:rPr>
-        <w:t xml:space="preserve">📷  SCREENSHOT — Keycloak reset password — Temporary off</w:t>
+        <w:t>📷  SCREENSHOT — Keycloak reset password — Temporary off</w:t>
       </w:r>
     </w:p>
     <w:p>
@@ -2459,7 +2382,7 @@
         <w:pStyle w:val="ListParagraph"/>
         <w:numPr>
           <w:ilvl w:val="0"/>
-          <w:numId w:val="100"/>
+          <w:numId w:val="7"/>
         </w:numPr>
         <w:spacing w:after="80" w:line="264" w:lineRule="auto"/>
       </w:pPr>
@@ -2471,7 +2394,7 @@
           <w:b/>
           <w:bCs/>
         </w:rPr>
-        <w:t xml:space="preserve">Management → Users &amp; Communities → Users</w:t>
+        <w:t>Management → Users &amp; Communities → Users</w:t>
       </w:r>
       <w:r>
         <w:t xml:space="preserve">, open </w:t>
@@ -2483,7 +2406,7 @@
           <w:sz w:val="20"/>
           <w:szCs w:val="20"/>
         </w:rPr>
-        <w:t xml:space="preserve">catalog.admin</w:t>
+        <w:t>catalog.admin</w:t>
       </w:r>
       <w:r>
         <w:t xml:space="preserve">, click </w:t>
@@ -2493,7 +2416,7 @@
           <w:b/>
           <w:bCs/>
         </w:rPr>
-        <w:t xml:space="preserve">Add Roles</w:t>
+        <w:t>Add Roles</w:t>
       </w:r>
       <w:r>
         <w:t xml:space="preserve">, tick all seven roles, and click </w:t>
@@ -2503,10 +2426,10 @@
           <w:b/>
           <w:bCs/>
         </w:rPr>
-        <w:t xml:space="preserve">Done</w:t>
-      </w:r>
-      <w:r>
-        <w:t xml:space="preserve">.</w:t>
+        <w:t>Done</w:t>
+      </w:r>
+      <w:r>
+        <w:t>.</w:t>
       </w:r>
     </w:p>
     <w:p>
@@ -2518,9 +2441,9 @@
           <w:right w:val="dashed" w:sz="8" w:space="6" w:color="C8A028"/>
         </w:pBdr>
         <w:shd w:val="clear" w:color="auto" w:fill="FFF7E0"/>
-        <w:jc w:val="center"/>
         <w:spacing w:before="120" w:after="200"/>
         <w:ind w:left="240" w:right="240"/>
+        <w:jc w:val="center"/>
       </w:pPr>
       <w:r>
         <w:rPr>
@@ -2528,7 +2451,7 @@
           <w:bCs/>
           <w:color w:val="8A6D1A"/>
         </w:rPr>
-        <w:t xml:space="preserve">📷  SCREENSHOT — catalog.admin — all seven roles assigned</w:t>
+        <w:t>📷  SCREENSHOT — catalog.admin — all seven roles assigned</w:t>
       </w:r>
     </w:p>
     <w:p>
@@ -2536,7 +2459,7 @@
         <w:pStyle w:val="ListParagraph"/>
         <w:numPr>
           <w:ilvl w:val="0"/>
-          <w:numId w:val="100"/>
+          <w:numId w:val="7"/>
         </w:numPr>
         <w:spacing w:after="80" w:line="264" w:lineRule="auto"/>
       </w:pPr>
@@ -2548,7 +2471,7 @@
           <w:b/>
           <w:bCs/>
         </w:rPr>
-        <w:t xml:space="preserve">Done</w:t>
+        <w:t>Done</w:t>
       </w:r>
       <w:r>
         <w:t xml:space="preserve"> again to apply the changes.</w:t>
@@ -2560,15 +2483,15 @@
           <w:left w:val="single" w:sz="12" w:space="8" w:color="065A82"/>
         </w:pBdr>
         <w:shd w:val="clear" w:color="auto" w:fill="EEF6FA"/>
+        <w:spacing w:before="120" w:after="160"/>
         <w:ind w:left="240" w:right="240"/>
-        <w:spacing w:before="120" w:after="160"/>
       </w:pPr>
       <w:r>
         <w:rPr>
           <w:b/>
           <w:bCs/>
         </w:rPr>
-        <w:t xml:space="preserve">Why grant the admin every role?</w:t>
+        <w:t>Why grant the admin every role?</w:t>
       </w:r>
       <w:r>
         <w:t xml:space="preserve"> Across the course the trainer account needs to demonstrate any action — connect a source (Data Storage Administrator), curate a term (Business Steward), author a rule (Data Developer), administer users (Admin). Granting all roles avoids switching accounts mid-lesson. If the PDC UI refuses an overlapping combination, assign the roles directly as Keycloak realm roles instead, which is not subject to the UI's same-base restriction. Watch the licence cap on Expert seats.</w:t>
@@ -2578,8 +2501,14 @@
       <w:pPr>
         <w:pStyle w:val="Heading2"/>
       </w:pPr>
-      <w:r>
-        <w:t xml:space="preserve">Part B — Add the CSCU users (Data Catalog)</w:t>
+    </w:p>
+    <w:p>
+      <w:pPr>
+        <w:pStyle w:val="Heading2"/>
+      </w:pPr>
+      <w:r>
+        <w:lastRenderedPageBreak/>
+        <w:t>Part B — Add the CSCU users (Data Catalog)</w:t>
       </w:r>
     </w:p>
     <w:p>
@@ -2596,7 +2525,7 @@
           <w:sz w:val="20"/>
           <w:szCs w:val="20"/>
         </w:rPr>
-        <w:t xml:space="preserve">catalog.admin</w:t>
+        <w:t>catalog.admin</w:t>
       </w:r>
       <w:r>
         <w:t xml:space="preserve"> / </w:t>
@@ -2608,10 +2537,10 @@
           <w:sz w:val="20"/>
           <w:szCs w:val="20"/>
         </w:rPr>
-        <w:t xml:space="preserve">copperstate</w:t>
-      </w:r>
-      <w:r>
-        <w:t xml:space="preserve">. Confirm the Administration area is visible — proof the Admin role took effect — then add each user from the roster.</w:t>
+        <w:t>copperstate</w:t>
+      </w:r>
+      <w:r>
+        <w:t>. Confirm the Administration area is visible — proof the Admin role took effect — then add each user from the roster.</w:t>
       </w:r>
     </w:p>
     <w:p>
@@ -2619,7 +2548,7 @@
         <w:pStyle w:val="ListParagraph"/>
         <w:numPr>
           <w:ilvl w:val="0"/>
-          <w:numId w:val="101"/>
+          <w:numId w:val="8"/>
         </w:numPr>
         <w:spacing w:after="80" w:line="264" w:lineRule="auto"/>
       </w:pPr>
@@ -2631,10 +2560,10 @@
           <w:b/>
           <w:bCs/>
         </w:rPr>
-        <w:t xml:space="preserve">Management</w:t>
-      </w:r>
-      <w:r>
-        <w:t xml:space="preserve">. The Manage Your Environment page opens.</w:t>
+        <w:t>Management</w:t>
+      </w:r>
+      <w:r>
+        <w:t>. The Manage Your Environment page opens.</w:t>
       </w:r>
     </w:p>
     <w:p>
@@ -2642,7 +2571,7 @@
         <w:pStyle w:val="ListParagraph"/>
         <w:numPr>
           <w:ilvl w:val="0"/>
-          <w:numId w:val="101"/>
+          <w:numId w:val="8"/>
         </w:numPr>
         <w:spacing w:after="80" w:line="264" w:lineRule="auto"/>
       </w:pPr>
@@ -2654,7 +2583,7 @@
           <w:b/>
           <w:bCs/>
         </w:rPr>
-        <w:t xml:space="preserve">Users &amp; Communities</w:t>
+        <w:t>Users &amp; Communities</w:t>
       </w:r>
       <w:r>
         <w:t xml:space="preserve"> card, click </w:t>
@@ -2664,7 +2593,7 @@
           <w:b/>
           <w:bCs/>
         </w:rPr>
-        <w:t xml:space="preserve">Add New</w:t>
+        <w:t>Add New</w:t>
       </w:r>
       <w:r>
         <w:t xml:space="preserve"> and select </w:t>
@@ -2674,10 +2603,10 @@
           <w:b/>
           <w:bCs/>
         </w:rPr>
-        <w:t xml:space="preserve">Add User</w:t>
-      </w:r>
-      <w:r>
-        <w:t xml:space="preserve">. The Create User page opens.</w:t>
+        <w:t>Add User</w:t>
+      </w:r>
+      <w:r>
+        <w:t>. The Create User page opens.</w:t>
       </w:r>
     </w:p>
     <w:p>
@@ -2685,7 +2614,7 @@
         <w:pStyle w:val="ListParagraph"/>
         <w:numPr>
           <w:ilvl w:val="0"/>
-          <w:numId w:val="101"/>
+          <w:numId w:val="8"/>
         </w:numPr>
         <w:spacing w:after="80" w:line="264" w:lineRule="auto"/>
       </w:pPr>
@@ -2699,7 +2628,7 @@
           <w:sz w:val="20"/>
           <w:szCs w:val="20"/>
         </w:rPr>
-        <w:t xml:space="preserve">nadia.flores</w:t>
+        <w:t>nadia.flores</w:t>
       </w:r>
       <w:r>
         <w:t xml:space="preserve"> / </w:t>
@@ -2711,10 +2640,10 @@
           <w:sz w:val="20"/>
           <w:szCs w:val="20"/>
         </w:rPr>
-        <w:t xml:space="preserve">nadia.flores@copperstatecu.org</w:t>
-      </w:r>
-      <w:r>
-        <w:t xml:space="preserve">).</w:t>
+        <w:t>nadia.flores@copperstatecu.org</w:t>
+      </w:r>
+      <w:r>
+        <w:t>).</w:t>
       </w:r>
     </w:p>
     <w:p>
@@ -2722,7 +2651,7 @@
         <w:pStyle w:val="ListParagraph"/>
         <w:numPr>
           <w:ilvl w:val="0"/>
-          <w:numId w:val="101"/>
+          <w:numId w:val="8"/>
         </w:numPr>
         <w:spacing w:after="80" w:line="264" w:lineRule="auto"/>
       </w:pPr>
@@ -2734,7 +2663,7 @@
           <w:b/>
           <w:bCs/>
         </w:rPr>
-        <w:t xml:space="preserve">Add Roles</w:t>
+        <w:t>Add Roles</w:t>
       </w:r>
       <w:r>
         <w:t xml:space="preserve">, tick the role or roles listed for that user in the roster, and click </w:t>
@@ -2744,10 +2673,10 @@
           <w:b/>
           <w:bCs/>
         </w:rPr>
-        <w:t xml:space="preserve">Save</w:t>
-      </w:r>
-      <w:r>
-        <w:t xml:space="preserve">. Assign only what the mapping specifies — that is the least-privilege discipline in action.</w:t>
+        <w:t>Save</w:t>
+      </w:r>
+      <w:r>
+        <w:t>. Assign only what the mapping specifies — that is the least-privilege discipline in action.</w:t>
       </w:r>
     </w:p>
     <w:p>
@@ -2759,9 +2688,9 @@
           <w:right w:val="dashed" w:sz="8" w:space="6" w:color="C8A028"/>
         </w:pBdr>
         <w:shd w:val="clear" w:color="auto" w:fill="FFF7E0"/>
-        <w:jc w:val="center"/>
         <w:spacing w:before="120" w:after="200"/>
         <w:ind w:left="240" w:right="240"/>
+        <w:jc w:val="center"/>
       </w:pPr>
       <w:r>
         <w:rPr>
@@ -2769,7 +2698,7 @@
           <w:bCs/>
           <w:color w:val="8A6D1A"/>
         </w:rPr>
-        <w:t xml:space="preserve">📷  SCREENSHOT — Create User — nadia.flores with Business Steward</w:t>
+        <w:t>📷  SCREENSHOT — Create User — nadia.flores with Business Steward</w:t>
       </w:r>
     </w:p>
     <w:p>
@@ -2777,7 +2706,7 @@
         <w:pStyle w:val="ListParagraph"/>
         <w:numPr>
           <w:ilvl w:val="0"/>
-          <w:numId w:val="101"/>
+          <w:numId w:val="8"/>
         </w:numPr>
         <w:spacing w:after="80" w:line="264" w:lineRule="auto"/>
       </w:pPr>
@@ -2789,7 +2718,7 @@
           <w:b/>
           <w:bCs/>
         </w:rPr>
-        <w:t xml:space="preserve">Done</w:t>
+        <w:t>Done</w:t>
       </w:r>
       <w:r>
         <w:t xml:space="preserve"> to create the user. Repeat for all eight CSCU users. If you see an "exceeded licensed limit" message, you have assigned more Expert seats than the licence allows — see Troubleshooting.</w:t>
@@ -2800,7 +2729,7 @@
         <w:pStyle w:val="Heading2"/>
       </w:pPr>
       <w:r>
-        <w:t xml:space="preserve">Part C — Set each user's initial password (Keycloak)</w:t>
+        <w:t>Part C — Set each user's initial password (Keycloak)</w:t>
       </w:r>
     </w:p>
     <w:p>
@@ -2808,7 +2737,7 @@
         <w:spacing w:after="120"/>
       </w:pPr>
       <w:r>
-        <w:t xml:space="preserve">New PDC users have no usable password until one is set (or, if SMTP is configured, until they follow an emailed reset link). For a self-contained lab, set them directly.</w:t>
+        <w:t>New PDC users have no usable password until one is set (or, if SMTP is configured, until they follow an emailed reset link). For a self-contained lab, set them directly.</w:t>
       </w:r>
     </w:p>
     <w:p>
@@ -2816,7 +2745,7 @@
         <w:pStyle w:val="ListParagraph"/>
         <w:numPr>
           <w:ilvl w:val="0"/>
-          <w:numId w:val="102"/>
+          <w:numId w:val="9"/>
         </w:numPr>
         <w:spacing w:after="80" w:line="264" w:lineRule="auto"/>
       </w:pPr>
@@ -2828,7 +2757,7 @@
           <w:b/>
           <w:bCs/>
         </w:rPr>
-        <w:t xml:space="preserve">pdc</w:t>
+        <w:t>pdc</w:t>
       </w:r>
       <w:r>
         <w:t xml:space="preserve"> realm, open </w:t>
@@ -2838,7 +2767,7 @@
           <w:b/>
           <w:bCs/>
         </w:rPr>
-        <w:t xml:space="preserve">Users</w:t>
+        <w:t>Users</w:t>
       </w:r>
       <w:r>
         <w:t xml:space="preserve"> and select each newly created account. Note the </w:t>
@@ -2848,7 +2777,7 @@
           <w:b/>
           <w:bCs/>
         </w:rPr>
-        <w:t xml:space="preserve">UUID</w:t>
+        <w:t>UUID</w:t>
       </w:r>
       <w:r>
         <w:t xml:space="preserve"> that uniquely identifies the user — the Glossary Generator's roster binds people to PDC accounts by this UUID.</w:t>
@@ -2863,9 +2792,9 @@
           <w:right w:val="dashed" w:sz="8" w:space="6" w:color="C8A028"/>
         </w:pBdr>
         <w:shd w:val="clear" w:color="auto" w:fill="FFF7E0"/>
-        <w:jc w:val="center"/>
         <w:spacing w:before="120" w:after="200"/>
         <w:ind w:left="240" w:right="240"/>
+        <w:jc w:val="center"/>
       </w:pPr>
       <w:r>
         <w:rPr>
@@ -2873,7 +2802,7 @@
           <w:bCs/>
           <w:color w:val="8A6D1A"/>
         </w:rPr>
-        <w:t xml:space="preserve">📷  SCREENSHOT — Keycloak user detail — UUID visible</w:t>
+        <w:t>📷  SCREENSHOT — Keycloak user detail — UUID visible</w:t>
       </w:r>
     </w:p>
     <w:p>
@@ -2881,7 +2810,7 @@
         <w:pStyle w:val="ListParagraph"/>
         <w:numPr>
           <w:ilvl w:val="0"/>
-          <w:numId w:val="102"/>
+          <w:numId w:val="9"/>
         </w:numPr>
         <w:spacing w:after="80" w:line="264" w:lineRule="auto"/>
       </w:pPr>
@@ -2893,7 +2822,7 @@
           <w:b/>
           <w:bCs/>
         </w:rPr>
-        <w:t xml:space="preserve">Credentials</w:t>
+        <w:t>Credentials</w:t>
       </w:r>
       <w:r>
         <w:t xml:space="preserve"> tab, </w:t>
@@ -2903,7 +2832,7 @@
           <w:b/>
           <w:bCs/>
         </w:rPr>
-        <w:t xml:space="preserve">Reset password</w:t>
+        <w:t>Reset password</w:t>
       </w:r>
       <w:r>
         <w:t xml:space="preserve"> to the shared lab password </w:t>
@@ -2915,7 +2844,7 @@
           <w:sz w:val="20"/>
           <w:szCs w:val="20"/>
         </w:rPr>
-        <w:t xml:space="preserve">copperstate</w:t>
+        <w:t>copperstate</w:t>
       </w:r>
       <w:r>
         <w:t xml:space="preserve">, with Temporary turned </w:t>
@@ -2925,10 +2854,10 @@
           <w:b/>
           <w:bCs/>
         </w:rPr>
-        <w:t xml:space="preserve">off</w:t>
-      </w:r>
-      <w:r>
-        <w:t xml:space="preserve">. Save.</w:t>
+        <w:t>off</w:t>
+      </w:r>
+      <w:r>
+        <w:t>. Save.</w:t>
       </w:r>
     </w:p>
     <w:p>
@@ -2936,12 +2865,12 @@
         <w:pStyle w:val="ListParagraph"/>
         <w:numPr>
           <w:ilvl w:val="0"/>
-          <w:numId w:val="102"/>
+          <w:numId w:val="9"/>
         </w:numPr>
         <w:spacing w:after="80" w:line="264" w:lineRule="auto"/>
       </w:pPr>
       <w:r>
-        <w:t xml:space="preserve">Repeat for each user. In production you would instead enable SMTP and let users set their own passwords via the reset link — never a shared credential.</w:t>
+        <w:t>Repeat for each user. In production you would instead enable SMTP and let users set their own passwords via the reset link — never a shared credential.</w:t>
       </w:r>
     </w:p>
     <w:p>
@@ -2950,15 +2879,15 @@
           <w:left w:val="single" w:sz="12" w:space="8" w:color="065A82"/>
         </w:pBdr>
         <w:shd w:val="clear" w:color="auto" w:fill="EEF6FA"/>
+        <w:spacing w:before="120" w:after="160"/>
         <w:ind w:left="240" w:right="240"/>
-        <w:spacing w:before="120" w:after="160"/>
       </w:pPr>
       <w:r>
         <w:rPr>
           <w:b/>
           <w:bCs/>
         </w:rPr>
-        <w:t xml:space="preserve">Least privilege, from the first screen.</w:t>
+        <w:t>Least privilege, from the first screen.</w:t>
       </w:r>
       <w:r>
         <w:t xml:space="preserve"> Notice what you did not do: you did not give every steward the Admin role, and you did not give the analyst any steward role. </w:t>
@@ -2970,7 +2899,7 @@
           <w:sz w:val="20"/>
           <w:szCs w:val="20"/>
         </w:rPr>
-        <w:t xml:space="preserve">nadia.flores</w:t>
+        <w:t>nadia.flores</w:t>
       </w:r>
       <w:r>
         <w:t xml:space="preserve"> can shape the glossary but cannot touch a data source; </w:t>
@@ -2982,7 +2911,7 @@
           <w:sz w:val="20"/>
           <w:szCs w:val="20"/>
         </w:rPr>
-        <w:t xml:space="preserve">jordan.blake</w:t>
+        <w:t>jordan.blake</w:t>
       </w:r>
       <w:r>
         <w:t xml:space="preserve"> can read the catalog but cannot administer users; </w:t>
@@ -2994,7 +2923,7 @@
           <w:sz w:val="20"/>
           <w:szCs w:val="20"/>
         </w:rPr>
-        <w:t xml:space="preserve">dana.ortiz</w:t>
+        <w:t>dana.ortiz</w:t>
       </w:r>
       <w:r>
         <w:t xml:space="preserve"> can author business rules that even the Admin role cannot. That separation is exactly what an examiner expects to see, and it is why the later workshops can show real ownership rather than a single god-account doing everything.</w:t>
@@ -3005,7 +2934,7 @@
         <w:pStyle w:val="Heading1"/>
       </w:pPr>
       <w:r>
-        <w:t xml:space="preserve">Who does what — the cast across the workshops</w:t>
+        <w:t>Who does what — the cast across the workshops</w:t>
       </w:r>
     </w:p>
     <w:tbl>
@@ -3019,6 +2948,7 @@
           <w:insideH w:val="single" w:sz="4" w:space="0" w:color="C9DEE8"/>
           <w:insideV w:val="single" w:sz="4" w:space="0" w:color="C9DEE8"/>
         </w:tblBorders>
+        <w:tblLook w:val="04A0" w:firstRow="1" w:lastRow="0" w:firstColumn="1" w:lastColumn="0" w:noHBand="0" w:noVBand="1"/>
       </w:tblPr>
       <w:tblGrid>
         <w:gridCol w:w="2500"/>
@@ -3029,27 +2959,24 @@
         <w:tc>
           <w:tcPr>
             <w:tcW w:w="2500" w:type="dxa"/>
-            <w:shd w:val="clear" w:color="auto" w:fill="EEF6FA"/>
             <w:tcBorders>
               <w:left w:val="single" w:sz="12" w:space="0" w:color="065A82"/>
             </w:tcBorders>
-            <w:tcMar>
-              <w:top w:w="120" w:type="dxa"/>
-              <w:left w:w="180" w:type="dxa"/>
-              <w:bottom w:w="120" w:type="dxa"/>
-              <w:right w:w="180" w:type="dxa"/>
-            </w:tcMar>
-          </w:tcPr>
-          <w:p>
-            <w:pPr>
-              <w:spacing w:after="0"/>
-            </w:pPr>
+            <w:shd w:val="clear" w:color="auto" w:fill="EEF6FA"/>
+            <w:tcMar>
+              <w:top w:w="120" w:type="dxa"/>
+              <w:left w:w="180" w:type="dxa"/>
+              <w:bottom w:w="120" w:type="dxa"/>
+              <w:right w:w="180" w:type="dxa"/>
+            </w:tcMar>
+          </w:tcPr>
+          <w:p>
             <w:r>
               <w:rPr>
                 <w:b/>
                 <w:bCs/>
               </w:rPr>
-              <w:t xml:space="preserve">Workshop / task</w:t>
+              <w:t>Workshop / task</w:t>
             </w:r>
           </w:p>
         </w:tc>
@@ -3065,15 +2992,12 @@
             </w:tcMar>
           </w:tcPr>
           <w:p>
-            <w:pPr>
-              <w:spacing w:after="0"/>
-            </w:pPr>
             <w:r>
               <w:rPr>
                 <w:b/>
                 <w:bCs/>
               </w:rPr>
-              <w:t xml:space="preserve">Performed as</w:t>
+              <w:t>Performed as</w:t>
             </w:r>
           </w:p>
         </w:tc>
@@ -3089,15 +3013,12 @@
             </w:tcMar>
           </w:tcPr>
           <w:p>
-            <w:pPr>
-              <w:spacing w:after="0"/>
-            </w:pPr>
             <w:r>
               <w:rPr>
                 <w:b/>
                 <w:bCs/>
               </w:rPr>
-              <w:t xml:space="preserve">Why that role</w:t>
+              <w:t>Why that role</w:t>
             </w:r>
           </w:p>
         </w:tc>
@@ -3114,28 +3035,23 @@
             </w:tcMar>
           </w:tcPr>
           <w:p>
-            <w:pPr>
-              <w:spacing w:after="0"/>
-            </w:pPr>
-            <w:r>
-              <w:t xml:space="preserve">W0 provision users</w:t>
-            </w:r>
-          </w:p>
-        </w:tc>
-        <w:tc>
-          <w:tcPr>
-            <w:tcW w:w="3430" w:type="dxa"/>
-            <w:tcMar>
-              <w:top w:w="120" w:type="dxa"/>
-              <w:left w:w="180" w:type="dxa"/>
-              <w:bottom w:w="120" w:type="dxa"/>
-              <w:right w:w="180" w:type="dxa"/>
-            </w:tcMar>
-          </w:tcPr>
-          <w:p>
-            <w:pPr>
-              <w:spacing w:after="0"/>
-            </w:pPr>
+            <w:r>
+              <w:lastRenderedPageBreak/>
+              <w:t>W0 provision users</w:t>
+            </w:r>
+          </w:p>
+        </w:tc>
+        <w:tc>
+          <w:tcPr>
+            <w:tcW w:w="3430" w:type="dxa"/>
+            <w:tcMar>
+              <w:top w:w="120" w:type="dxa"/>
+              <w:left w:w="180" w:type="dxa"/>
+              <w:bottom w:w="120" w:type="dxa"/>
+              <w:right w:w="180" w:type="dxa"/>
+            </w:tcMar>
+          </w:tcPr>
+          <w:p>
             <w:r>
               <w:rPr>
                 <w:rFonts w:ascii="Consolas" w:hAnsi="Consolas"/>
@@ -3143,26 +3059,23 @@
                 <w:sz w:val="20"/>
                 <w:szCs w:val="20"/>
               </w:rPr>
-              <w:t xml:space="preserve">catalog.admin</w:t>
-            </w:r>
-          </w:p>
-        </w:tc>
-        <w:tc>
-          <w:tcPr>
-            <w:tcW w:w="3430" w:type="dxa"/>
-            <w:tcMar>
-              <w:top w:w="120" w:type="dxa"/>
-              <w:left w:w="180" w:type="dxa"/>
-              <w:bottom w:w="120" w:type="dxa"/>
-              <w:right w:w="180" w:type="dxa"/>
-            </w:tcMar>
-          </w:tcPr>
-          <w:p>
-            <w:pPr>
-              <w:spacing w:after="0"/>
-            </w:pPr>
-            <w:r>
-              <w:t xml:space="preserve">Admin manages users, roles, communities</w:t>
+              <w:t>catalog.admin</w:t>
+            </w:r>
+          </w:p>
+        </w:tc>
+        <w:tc>
+          <w:tcPr>
+            <w:tcW w:w="3430" w:type="dxa"/>
+            <w:tcMar>
+              <w:top w:w="120" w:type="dxa"/>
+              <w:left w:w="180" w:type="dxa"/>
+              <w:bottom w:w="120" w:type="dxa"/>
+              <w:right w:w="180" w:type="dxa"/>
+            </w:tcMar>
+          </w:tcPr>
+          <w:p>
+            <w:r>
+              <w:t>Admin manages users, roles, communities</w:t>
             </w:r>
           </w:p>
         </w:tc>
@@ -3179,28 +3092,22 @@
             </w:tcMar>
           </w:tcPr>
           <w:p>
-            <w:pPr>
-              <w:spacing w:after="0"/>
-            </w:pPr>
-            <w:r>
-              <w:t xml:space="preserve">W1 create + ingest both sources, Scan Files</w:t>
-            </w:r>
-          </w:p>
-        </w:tc>
-        <w:tc>
-          <w:tcPr>
-            <w:tcW w:w="3430" w:type="dxa"/>
-            <w:tcMar>
-              <w:top w:w="120" w:type="dxa"/>
-              <w:left w:w="180" w:type="dxa"/>
-              <w:bottom w:w="120" w:type="dxa"/>
-              <w:right w:w="180" w:type="dxa"/>
-            </w:tcMar>
-          </w:tcPr>
-          <w:p>
-            <w:pPr>
-              <w:spacing w:after="0"/>
-            </w:pPr>
+            <w:r>
+              <w:t>W1 create + ingest both sources, Scan Files</w:t>
+            </w:r>
+          </w:p>
+        </w:tc>
+        <w:tc>
+          <w:tcPr>
+            <w:tcW w:w="3430" w:type="dxa"/>
+            <w:tcMar>
+              <w:top w:w="120" w:type="dxa"/>
+              <w:left w:w="180" w:type="dxa"/>
+              <w:bottom w:w="120" w:type="dxa"/>
+              <w:right w:w="180" w:type="dxa"/>
+            </w:tcMar>
+          </w:tcPr>
+          <w:p>
             <w:r>
               <w:rPr>
                 <w:rFonts w:ascii="Consolas" w:hAnsi="Consolas"/>
@@ -3208,26 +3115,23 @@
                 <w:sz w:val="20"/>
                 <w:szCs w:val="20"/>
               </w:rPr>
-              <w:t xml:space="preserve">omar.haddad</w:t>
-            </w:r>
-          </w:p>
-        </w:tc>
-        <w:tc>
-          <w:tcPr>
-            <w:tcW w:w="3430" w:type="dxa"/>
-            <w:tcMar>
-              <w:top w:w="120" w:type="dxa"/>
-              <w:left w:w="180" w:type="dxa"/>
-              <w:bottom w:w="120" w:type="dxa"/>
-              <w:right w:w="180" w:type="dxa"/>
-            </w:tcMar>
-          </w:tcPr>
-          <w:p>
-            <w:pPr>
-              <w:spacing w:after="0"/>
-            </w:pPr>
-            <w:r>
-              <w:t xml:space="preserve">Data Storage Administrator creates data sources (Elena's Data Steward role also can)</w:t>
+              <w:t>omar.haddad</w:t>
+            </w:r>
+          </w:p>
+        </w:tc>
+        <w:tc>
+          <w:tcPr>
+            <w:tcW w:w="3430" w:type="dxa"/>
+            <w:tcMar>
+              <w:top w:w="120" w:type="dxa"/>
+              <w:left w:w="180" w:type="dxa"/>
+              <w:bottom w:w="120" w:type="dxa"/>
+              <w:right w:w="180" w:type="dxa"/>
+            </w:tcMar>
+          </w:tcPr>
+          <w:p>
+            <w:r>
+              <w:t>Data Storage Administrator creates data sources (Elena's Data Steward role also can)</w:t>
             </w:r>
           </w:p>
         </w:tc>
@@ -3244,28 +3148,22 @@
             </w:tcMar>
           </w:tcPr>
           <w:p>
-            <w:pPr>
-              <w:spacing w:after="0"/>
-            </w:pPr>
-            <w:r>
-              <w:t xml:space="preserve">W2 explore structure &amp; metadata</w:t>
-            </w:r>
-          </w:p>
-        </w:tc>
-        <w:tc>
-          <w:tcPr>
-            <w:tcW w:w="3430" w:type="dxa"/>
-            <w:tcMar>
-              <w:top w:w="120" w:type="dxa"/>
-              <w:left w:w="180" w:type="dxa"/>
-              <w:bottom w:w="120" w:type="dxa"/>
-              <w:right w:w="180" w:type="dxa"/>
-            </w:tcMar>
-          </w:tcPr>
-          <w:p>
-            <w:pPr>
-              <w:spacing w:after="0"/>
-            </w:pPr>
+            <w:r>
+              <w:t>W2 explore structure &amp; metadata</w:t>
+            </w:r>
+          </w:p>
+        </w:tc>
+        <w:tc>
+          <w:tcPr>
+            <w:tcW w:w="3430" w:type="dxa"/>
+            <w:tcMar>
+              <w:top w:w="120" w:type="dxa"/>
+              <w:left w:w="180" w:type="dxa"/>
+              <w:bottom w:w="120" w:type="dxa"/>
+              <w:right w:w="180" w:type="dxa"/>
+            </w:tcMar>
+          </w:tcPr>
+          <w:p>
             <w:r>
               <w:rPr>
                 <w:rFonts w:ascii="Consolas" w:hAnsi="Consolas"/>
@@ -3273,24 +3171,21 @@
                 <w:sz w:val="20"/>
                 <w:szCs w:val="20"/>
               </w:rPr>
-              <w:t xml:space="preserve">jordan.blake</w:t>
-            </w:r>
-          </w:p>
-        </w:tc>
-        <w:tc>
-          <w:tcPr>
-            <w:tcW w:w="3430" w:type="dxa"/>
-            <w:tcMar>
-              <w:top w:w="120" w:type="dxa"/>
-              <w:left w:w="180" w:type="dxa"/>
-              <w:bottom w:w="120" w:type="dxa"/>
-              <w:right w:w="180" w:type="dxa"/>
-            </w:tcMar>
-          </w:tcPr>
-          <w:p>
-            <w:pPr>
-              <w:spacing w:after="0"/>
-            </w:pPr>
+              <w:t>jordan.blake</w:t>
+            </w:r>
+          </w:p>
+        </w:tc>
+        <w:tc>
+          <w:tcPr>
+            <w:tcW w:w="3430" w:type="dxa"/>
+            <w:tcMar>
+              <w:top w:w="120" w:type="dxa"/>
+              <w:left w:w="180" w:type="dxa"/>
+              <w:bottom w:w="120" w:type="dxa"/>
+              <w:right w:w="180" w:type="dxa"/>
+            </w:tcMar>
+          </w:tcPr>
+          <w:p>
             <w:r>
               <w:t xml:space="preserve">Data User views data assets (repeat one step as </w:t>
             </w:r>
@@ -3301,7 +3196,7 @@
                 <w:sz w:val="20"/>
                 <w:szCs w:val="20"/>
               </w:rPr>
-              <w:t xml:space="preserve">riley.morgan</w:t>
+              <w:t>riley.morgan</w:t>
             </w:r>
             <w:r>
               <w:t xml:space="preserve"> to see the Business User boundary)</w:t>
@@ -3321,28 +3216,22 @@
             </w:tcMar>
           </w:tcPr>
           <w:p>
-            <w:pPr>
-              <w:spacing w:after="0"/>
-            </w:pPr>
-            <w:r>
-              <w:t xml:space="preserve">W3 import + review the glossary</w:t>
-            </w:r>
-          </w:p>
-        </w:tc>
-        <w:tc>
-          <w:tcPr>
-            <w:tcW w:w="3430" w:type="dxa"/>
-            <w:tcMar>
-              <w:top w:w="120" w:type="dxa"/>
-              <w:left w:w="180" w:type="dxa"/>
-              <w:bottom w:w="120" w:type="dxa"/>
-              <w:right w:w="180" w:type="dxa"/>
-            </w:tcMar>
-          </w:tcPr>
-          <w:p>
-            <w:pPr>
-              <w:spacing w:after="0"/>
-            </w:pPr>
+            <w:r>
+              <w:t>W3 import + review the glossary</w:t>
+            </w:r>
+          </w:p>
+        </w:tc>
+        <w:tc>
+          <w:tcPr>
+            <w:tcW w:w="3430" w:type="dxa"/>
+            <w:tcMar>
+              <w:top w:w="120" w:type="dxa"/>
+              <w:left w:w="180" w:type="dxa"/>
+              <w:bottom w:w="120" w:type="dxa"/>
+              <w:right w:w="180" w:type="dxa"/>
+            </w:tcMar>
+          </w:tcPr>
+          <w:p>
             <w:r>
               <w:rPr>
                 <w:rFonts w:ascii="Consolas" w:hAnsi="Consolas"/>
@@ -3350,7 +3239,7 @@
                 <w:sz w:val="20"/>
                 <w:szCs w:val="20"/>
               </w:rPr>
-              <w:t xml:space="preserve">nadia.flores</w:t>
+              <w:t>nadia.flores</w:t>
             </w:r>
             <w:r>
               <w:t xml:space="preserve"> (any Business Steward)</w:t>
@@ -3368,11 +3257,8 @@
             </w:tcMar>
           </w:tcPr>
           <w:p>
-            <w:pPr>
-              <w:spacing w:after="0"/>
-            </w:pPr>
-            <w:r>
-              <w:t xml:space="preserve">Business Steward creates/imports glossaries</w:t>
+            <w:r>
+              <w:t>Business Steward creates/imports glossaries</w:t>
             </w:r>
           </w:p>
         </w:tc>
@@ -3389,28 +3275,22 @@
             </w:tcMar>
           </w:tcPr>
           <w:p>
-            <w:pPr>
-              <w:spacing w:after="0"/>
-            </w:pPr>
-            <w:r>
-              <w:t xml:space="preserve">W3 link terms to columns</w:t>
-            </w:r>
-          </w:p>
-        </w:tc>
-        <w:tc>
-          <w:tcPr>
-            <w:tcW w:w="3430" w:type="dxa"/>
-            <w:tcMar>
-              <w:top w:w="120" w:type="dxa"/>
-              <w:left w:w="180" w:type="dxa"/>
-              <w:bottom w:w="120" w:type="dxa"/>
-              <w:right w:w="180" w:type="dxa"/>
-            </w:tcMar>
-          </w:tcPr>
-          <w:p>
-            <w:pPr>
-              <w:spacing w:after="0"/>
-            </w:pPr>
+            <w:r>
+              <w:t>W3 link terms to columns</w:t>
+            </w:r>
+          </w:p>
+        </w:tc>
+        <w:tc>
+          <w:tcPr>
+            <w:tcW w:w="3430" w:type="dxa"/>
+            <w:tcMar>
+              <w:top w:w="120" w:type="dxa"/>
+              <w:left w:w="180" w:type="dxa"/>
+              <w:bottom w:w="120" w:type="dxa"/>
+              <w:right w:w="180" w:type="dxa"/>
+            </w:tcMar>
+          </w:tcPr>
+          <w:p>
             <w:r>
               <w:rPr>
                 <w:rFonts w:ascii="Consolas" w:hAnsi="Consolas"/>
@@ -3418,26 +3298,23 @@
                 <w:sz w:val="20"/>
                 <w:szCs w:val="20"/>
               </w:rPr>
-              <w:t xml:space="preserve">elena.ramirez</w:t>
-            </w:r>
-          </w:p>
-        </w:tc>
-        <w:tc>
-          <w:tcPr>
-            <w:tcW w:w="3430" w:type="dxa"/>
-            <w:tcMar>
-              <w:top w:w="120" w:type="dxa"/>
-              <w:left w:w="180" w:type="dxa"/>
-              <w:bottom w:w="120" w:type="dxa"/>
-              <w:right w:w="180" w:type="dxa"/>
-            </w:tcMar>
-          </w:tcPr>
-          <w:p>
-            <w:pPr>
-              <w:spacing w:after="0"/>
-            </w:pPr>
-            <w:r>
-              <w:t xml:space="preserve">Needs data-source write — her Data Steward side</w:t>
+              <w:t>elena.ramirez</w:t>
+            </w:r>
+          </w:p>
+        </w:tc>
+        <w:tc>
+          <w:tcPr>
+            <w:tcW w:w="3430" w:type="dxa"/>
+            <w:tcMar>
+              <w:top w:w="120" w:type="dxa"/>
+              <w:left w:w="180" w:type="dxa"/>
+              <w:bottom w:w="120" w:type="dxa"/>
+              <w:right w:w="180" w:type="dxa"/>
+            </w:tcMar>
+          </w:tcPr>
+          <w:p>
+            <w:r>
+              <w:t>Needs data-source write — her Data Steward side</w:t>
             </w:r>
           </w:p>
         </w:tc>
@@ -3454,28 +3331,22 @@
             </w:tcMar>
           </w:tcPr>
           <w:p>
-            <w:pPr>
-              <w:spacing w:after="0"/>
-            </w:pPr>
-            <w:r>
-              <w:t xml:space="preserve">W4 profile the tables</w:t>
-            </w:r>
-          </w:p>
-        </w:tc>
-        <w:tc>
-          <w:tcPr>
-            <w:tcW w:w="3430" w:type="dxa"/>
-            <w:tcMar>
-              <w:top w:w="120" w:type="dxa"/>
-              <w:left w:w="180" w:type="dxa"/>
-              <w:bottom w:w="120" w:type="dxa"/>
-              <w:right w:w="180" w:type="dxa"/>
-            </w:tcMar>
-          </w:tcPr>
-          <w:p>
-            <w:pPr>
-              <w:spacing w:after="0"/>
-            </w:pPr>
+            <w:r>
+              <w:t>W4 profile the tables</w:t>
+            </w:r>
+          </w:p>
+        </w:tc>
+        <w:tc>
+          <w:tcPr>
+            <w:tcW w:w="3430" w:type="dxa"/>
+            <w:tcMar>
+              <w:top w:w="120" w:type="dxa"/>
+              <w:left w:w="180" w:type="dxa"/>
+              <w:bottom w:w="120" w:type="dxa"/>
+              <w:right w:w="180" w:type="dxa"/>
+            </w:tcMar>
+          </w:tcPr>
+          <w:p>
             <w:r>
               <w:rPr>
                 <w:rFonts w:ascii="Consolas" w:hAnsi="Consolas"/>
@@ -3483,26 +3354,23 @@
                 <w:sz w:val="20"/>
                 <w:szCs w:val="20"/>
               </w:rPr>
-              <w:t xml:space="preserve">elena.ramirez</w:t>
-            </w:r>
-          </w:p>
-        </w:tc>
-        <w:tc>
-          <w:tcPr>
-            <w:tcW w:w="3430" w:type="dxa"/>
-            <w:tcMar>
-              <w:top w:w="120" w:type="dxa"/>
-              <w:left w:w="180" w:type="dxa"/>
-              <w:bottom w:w="120" w:type="dxa"/>
-              <w:right w:w="180" w:type="dxa"/>
-            </w:tcMar>
-          </w:tcPr>
-          <w:p>
-            <w:pPr>
-              <w:spacing w:after="0"/>
-            </w:pPr>
-            <w:r>
-              <w:t xml:space="preserve">Data Steward runs profiling jobs</w:t>
+              <w:t>elena.ramirez</w:t>
+            </w:r>
+          </w:p>
+        </w:tc>
+        <w:tc>
+          <w:tcPr>
+            <w:tcW w:w="3430" w:type="dxa"/>
+            <w:tcMar>
+              <w:top w:w="120" w:type="dxa"/>
+              <w:left w:w="180" w:type="dxa"/>
+              <w:bottom w:w="120" w:type="dxa"/>
+              <w:right w:w="180" w:type="dxa"/>
+            </w:tcMar>
+          </w:tcPr>
+          <w:p>
+            <w:r>
+              <w:t>Data Steward runs profiling jobs</w:t>
             </w:r>
           </w:p>
         </w:tc>
@@ -3519,28 +3387,22 @@
             </w:tcMar>
           </w:tcPr>
           <w:p>
-            <w:pPr>
-              <w:spacing w:after="0"/>
-            </w:pPr>
-            <w:r>
-              <w:t xml:space="preserve">W4 author the business rules</w:t>
-            </w:r>
-          </w:p>
-        </w:tc>
-        <w:tc>
-          <w:tcPr>
-            <w:tcW w:w="3430" w:type="dxa"/>
-            <w:tcMar>
-              <w:top w:w="120" w:type="dxa"/>
-              <w:left w:w="180" w:type="dxa"/>
-              <w:bottom w:w="120" w:type="dxa"/>
-              <w:right w:w="180" w:type="dxa"/>
-            </w:tcMar>
-          </w:tcPr>
-          <w:p>
-            <w:pPr>
-              <w:spacing w:after="0"/>
-            </w:pPr>
+            <w:r>
+              <w:t>W4 author the business rules</w:t>
+            </w:r>
+          </w:p>
+        </w:tc>
+        <w:tc>
+          <w:tcPr>
+            <w:tcW w:w="3430" w:type="dxa"/>
+            <w:tcMar>
+              <w:top w:w="120" w:type="dxa"/>
+              <w:left w:w="180" w:type="dxa"/>
+              <w:bottom w:w="120" w:type="dxa"/>
+              <w:right w:w="180" w:type="dxa"/>
+            </w:tcMar>
+          </w:tcPr>
+          <w:p>
             <w:r>
               <w:rPr>
                 <w:rFonts w:ascii="Consolas" w:hAnsi="Consolas"/>
@@ -3548,26 +3410,23 @@
                 <w:sz w:val="20"/>
                 <w:szCs w:val="20"/>
               </w:rPr>
-              <w:t xml:space="preserve">dana.ortiz</w:t>
-            </w:r>
-          </w:p>
-        </w:tc>
-        <w:tc>
-          <w:tcPr>
-            <w:tcW w:w="3430" w:type="dxa"/>
-            <w:tcMar>
-              <w:top w:w="120" w:type="dxa"/>
-              <w:left w:w="180" w:type="dxa"/>
-              <w:bottom w:w="120" w:type="dxa"/>
-              <w:right w:w="180" w:type="dxa"/>
-            </w:tcMar>
-          </w:tcPr>
-          <w:p>
-            <w:pPr>
-              <w:spacing w:after="0"/>
-            </w:pPr>
-            <w:r>
-              <w:t xml:space="preserve">Data Developer owns Business Rules in v11</w:t>
+              <w:t>dana.ortiz</w:t>
+            </w:r>
+          </w:p>
+        </w:tc>
+        <w:tc>
+          <w:tcPr>
+            <w:tcW w:w="3430" w:type="dxa"/>
+            <w:tcMar>
+              <w:top w:w="120" w:type="dxa"/>
+              <w:left w:w="180" w:type="dxa"/>
+              <w:bottom w:w="120" w:type="dxa"/>
+              <w:right w:w="180" w:type="dxa"/>
+            </w:tcMar>
+          </w:tcPr>
+          <w:p>
+            <w:r>
+              <w:t>Data Developer owns Business Rules in v11</w:t>
             </w:r>
           </w:p>
         </w:tc>
@@ -3584,28 +3443,22 @@
             </w:tcMar>
           </w:tcPr>
           <w:p>
-            <w:pPr>
-              <w:spacing w:after="0"/>
-            </w:pPr>
-            <w:r>
-              <w:t xml:space="preserve">W5 dictionaries, patterns, identification</w:t>
-            </w:r>
-          </w:p>
-        </w:tc>
-        <w:tc>
-          <w:tcPr>
-            <w:tcW w:w="3430" w:type="dxa"/>
-            <w:tcMar>
-              <w:top w:w="120" w:type="dxa"/>
-              <w:left w:w="180" w:type="dxa"/>
-              <w:bottom w:w="120" w:type="dxa"/>
-              <w:right w:w="180" w:type="dxa"/>
-            </w:tcMar>
-          </w:tcPr>
-          <w:p>
-            <w:pPr>
-              <w:spacing w:after="0"/>
-            </w:pPr>
+            <w:r>
+              <w:t>W5 dictionaries, patterns, identification</w:t>
+            </w:r>
+          </w:p>
+        </w:tc>
+        <w:tc>
+          <w:tcPr>
+            <w:tcW w:w="3430" w:type="dxa"/>
+            <w:tcMar>
+              <w:top w:w="120" w:type="dxa"/>
+              <w:left w:w="180" w:type="dxa"/>
+              <w:bottom w:w="120" w:type="dxa"/>
+              <w:right w:w="180" w:type="dxa"/>
+            </w:tcMar>
+          </w:tcPr>
+          <w:p>
             <w:r>
               <w:rPr>
                 <w:rFonts w:ascii="Consolas" w:hAnsi="Consolas"/>
@@ -3613,26 +3466,23 @@
                 <w:sz w:val="20"/>
                 <w:szCs w:val="20"/>
               </w:rPr>
-              <w:t xml:space="preserve">elena.ramirez</w:t>
-            </w:r>
-          </w:p>
-        </w:tc>
-        <w:tc>
-          <w:tcPr>
-            <w:tcW w:w="3430" w:type="dxa"/>
-            <w:tcMar>
-              <w:top w:w="120" w:type="dxa"/>
-              <w:left w:w="180" w:type="dxa"/>
-              <w:bottom w:w="120" w:type="dxa"/>
-              <w:right w:w="180" w:type="dxa"/>
-            </w:tcMar>
-          </w:tcPr>
-          <w:p>
-            <w:pPr>
-              <w:spacing w:after="0"/>
-            </w:pPr>
-            <w:r>
-              <w:t xml:space="preserve">Data Steward owns Data Identification Methods (so does Omar)</w:t>
+              <w:t>elena.ramirez</w:t>
+            </w:r>
+          </w:p>
+        </w:tc>
+        <w:tc>
+          <w:tcPr>
+            <w:tcW w:w="3430" w:type="dxa"/>
+            <w:tcMar>
+              <w:top w:w="120" w:type="dxa"/>
+              <w:left w:w="180" w:type="dxa"/>
+              <w:bottom w:w="120" w:type="dxa"/>
+              <w:right w:w="180" w:type="dxa"/>
+            </w:tcMar>
+          </w:tcPr>
+          <w:p>
+            <w:r>
+              <w:t>Data Steward owns Data Identification Methods (so does Omar)</w:t>
             </w:r>
           </w:p>
         </w:tc>
@@ -3649,28 +3499,22 @@
             </w:tcMar>
           </w:tcPr>
           <w:p>
-            <w:pPr>
-              <w:spacing w:after="0"/>
-            </w:pPr>
-            <w:r>
-              <w:t xml:space="preserve">Technical Track modules 02-03</w:t>
-            </w:r>
-          </w:p>
-        </w:tc>
-        <w:tc>
-          <w:tcPr>
-            <w:tcW w:w="3430" w:type="dxa"/>
-            <w:tcMar>
-              <w:top w:w="120" w:type="dxa"/>
-              <w:left w:w="180" w:type="dxa"/>
-              <w:bottom w:w="120" w:type="dxa"/>
-              <w:right w:w="180" w:type="dxa"/>
-            </w:tcMar>
-          </w:tcPr>
-          <w:p>
-            <w:pPr>
-              <w:spacing w:after="0"/>
-            </w:pPr>
+            <w:r>
+              <w:t>Technical Track modules 02-03</w:t>
+            </w:r>
+          </w:p>
+        </w:tc>
+        <w:tc>
+          <w:tcPr>
+            <w:tcW w:w="3430" w:type="dxa"/>
+            <w:tcMar>
+              <w:top w:w="120" w:type="dxa"/>
+              <w:left w:w="180" w:type="dxa"/>
+              <w:bottom w:w="120" w:type="dxa"/>
+              <w:right w:w="180" w:type="dxa"/>
+            </w:tcMar>
+          </w:tcPr>
+          <w:p>
             <w:r>
               <w:rPr>
                 <w:rFonts w:ascii="Consolas" w:hAnsi="Consolas"/>
@@ -3678,7 +3522,7 @@
                 <w:sz w:val="20"/>
                 <w:szCs w:val="20"/>
               </w:rPr>
-              <w:t xml:space="preserve">elena.ramirez</w:t>
+              <w:t>elena.ramirez</w:t>
             </w:r>
             <w:r>
               <w:t xml:space="preserve"> or </w:t>
@@ -3690,26 +3534,23 @@
                 <w:sz w:val="20"/>
                 <w:szCs w:val="20"/>
               </w:rPr>
-              <w:t xml:space="preserve">omar.haddad</w:t>
-            </w:r>
-          </w:p>
-        </w:tc>
-        <w:tc>
-          <w:tcPr>
-            <w:tcW w:w="3430" w:type="dxa"/>
-            <w:tcMar>
-              <w:top w:w="120" w:type="dxa"/>
-              <w:left w:w="180" w:type="dxa"/>
-              <w:bottom w:w="120" w:type="dxa"/>
-              <w:right w:w="180" w:type="dxa"/>
-            </w:tcMar>
-          </w:tcPr>
-          <w:p>
-            <w:pPr>
-              <w:spacing w:after="0"/>
-            </w:pPr>
-            <w:r>
-              <w:t xml:space="preserve">DI method authoring is role-gated to those two</w:t>
+              <w:t>omar.haddad</w:t>
+            </w:r>
+          </w:p>
+        </w:tc>
+        <w:tc>
+          <w:tcPr>
+            <w:tcW w:w="3430" w:type="dxa"/>
+            <w:tcMar>
+              <w:top w:w="120" w:type="dxa"/>
+              <w:left w:w="180" w:type="dxa"/>
+              <w:bottom w:w="120" w:type="dxa"/>
+              <w:right w:w="180" w:type="dxa"/>
+            </w:tcMar>
+          </w:tcPr>
+          <w:p>
+            <w:r>
+              <w:t>DI method authoring is role-gated to those two</w:t>
             </w:r>
           </w:p>
         </w:tc>
@@ -3725,7 +3566,7 @@
         <w:pStyle w:val="Heading1"/>
       </w:pPr>
       <w:r>
-        <w:t xml:space="preserve">Verify your work</w:t>
+        <w:t>Verify your work</w:t>
       </w:r>
     </w:p>
     <w:p>
@@ -3733,7 +3574,7 @@
         <w:spacing w:after="120"/>
       </w:pPr>
       <w:r>
-        <w:t xml:space="preserve">You are done with Workshop 0 when all of the following are true:</w:t>
+        <w:t>You are done with Workshop 0 when all of the following are true:</w:t>
       </w:r>
     </w:p>
     <w:p>
@@ -3755,7 +3596,7 @@
           <w:sz w:val="20"/>
           <w:szCs w:val="20"/>
         </w:rPr>
-        <w:t xml:space="preserve">catalog.admin</w:t>
+        <w:t>catalog.admin</w:t>
       </w:r>
       <w:r>
         <w:t xml:space="preserve"> signs in to PDC with the password </w:t>
@@ -3767,7 +3608,7 @@
           <w:sz w:val="20"/>
           <w:szCs w:val="20"/>
         </w:rPr>
-        <w:t xml:space="preserve">copperstate</w:t>
+        <w:t>copperstate</w:t>
       </w:r>
       <w:r>
         <w:t xml:space="preserve"> and sees the Administration area.</w:t>
@@ -3783,7 +3624,7 @@
         <w:spacing w:after="60"/>
       </w:pPr>
       <w:r>
-        <w:t xml:space="preserve">☐  All eight CSCU users exist under Users &amp; Communities, each with the role(s) from the roster — covering all seven PDC roles.</w:t>
+        <w:t>☐  All eight CSCU users exist under Users &amp; Communities, each with the role(s) from the roster — covering all seven PDC roles.</w:t>
       </w:r>
     </w:p>
     <w:p>
@@ -3805,10 +3646,10 @@
           <w:sz w:val="20"/>
           <w:szCs w:val="20"/>
         </w:rPr>
-        <w:t xml:space="preserve">nadia.flores</w:t>
-      </w:r>
-      <w:r>
-        <w:t xml:space="preserve">) can open Business Glossary but not create a data source.</w:t>
+        <w:t>nadia.flores</w:t>
+      </w:r>
+      <w:r>
+        <w:t>) can open Business Glossary but not create a data source.</w:t>
       </w:r>
     </w:p>
     <w:p>
@@ -3821,7 +3662,7 @@
         <w:spacing w:after="60"/>
       </w:pPr>
       <w:r>
-        <w:t xml:space="preserve">☐  A Data Storage Administrator (</w:t>
+        <w:t>☐  A Data Storage Administrator (</w:t>
       </w:r>
       <w:r>
         <w:rPr>
@@ -3830,10 +3671,10 @@
           <w:sz w:val="20"/>
           <w:szCs w:val="20"/>
         </w:rPr>
-        <w:t xml:space="preserve">omar.haddad</w:t>
-      </w:r>
-      <w:r>
-        <w:t xml:space="preserve">) can add a data source, which the analyst account cannot.</w:t>
+        <w:t>omar.haddad</w:t>
+      </w:r>
+      <w:r>
+        <w:t>) can add a data source, which the analyst account cannot.</w:t>
       </w:r>
     </w:p>
     <w:p>
@@ -3846,7 +3687,7 @@
         <w:spacing w:after="60"/>
       </w:pPr>
       <w:r>
-        <w:t xml:space="preserve">☐  No "exceeded licensed limit" warnings remain against any assignment.</w:t>
+        <w:t>☐  No "exceeded licensed limit" warnings remain against any assignment.</w:t>
       </w:r>
     </w:p>
     <w:p>
@@ -3854,7 +3695,8 @@
         <w:pStyle w:val="Heading1"/>
       </w:pPr>
       <w:r>
-        <w:t xml:space="preserve">Troubleshooting</w:t>
+        <w:lastRenderedPageBreak/>
+        <w:t>Troubleshooting</w:t>
       </w:r>
     </w:p>
     <w:tbl>
@@ -3868,6 +3710,7 @@
           <w:insideH w:val="single" w:sz="4" w:space="0" w:color="C9DEE8"/>
           <w:insideV w:val="single" w:sz="4" w:space="0" w:color="C9DEE8"/>
         </w:tblBorders>
+        <w:tblLook w:val="04A0" w:firstRow="1" w:lastRow="0" w:firstColumn="1" w:lastColumn="0" w:noHBand="0" w:noVBand="1"/>
       </w:tblPr>
       <w:tblGrid>
         <w:gridCol w:w="2900"/>
@@ -3877,27 +3720,24 @@
         <w:tc>
           <w:tcPr>
             <w:tcW w:w="2900" w:type="dxa"/>
-            <w:shd w:val="clear" w:color="auto" w:fill="EEF6FA"/>
             <w:tcBorders>
               <w:left w:val="single" w:sz="12" w:space="0" w:color="065A82"/>
             </w:tcBorders>
-            <w:tcMar>
-              <w:top w:w="120" w:type="dxa"/>
-              <w:left w:w="180" w:type="dxa"/>
-              <w:bottom w:w="120" w:type="dxa"/>
-              <w:right w:w="180" w:type="dxa"/>
-            </w:tcMar>
-          </w:tcPr>
-          <w:p>
-            <w:pPr>
-              <w:spacing w:after="0"/>
-            </w:pPr>
+            <w:shd w:val="clear" w:color="auto" w:fill="EEF6FA"/>
+            <w:tcMar>
+              <w:top w:w="120" w:type="dxa"/>
+              <w:left w:w="180" w:type="dxa"/>
+              <w:bottom w:w="120" w:type="dxa"/>
+              <w:right w:w="180" w:type="dxa"/>
+            </w:tcMar>
+          </w:tcPr>
+          <w:p>
             <w:r>
               <w:rPr>
                 <w:b/>
                 <w:bCs/>
               </w:rPr>
-              <w:t xml:space="preserve">Symptom</w:t>
+              <w:t>Symptom</w:t>
             </w:r>
           </w:p>
         </w:tc>
@@ -3913,15 +3753,12 @@
             </w:tcMar>
           </w:tcPr>
           <w:p>
-            <w:pPr>
-              <w:spacing w:after="0"/>
-            </w:pPr>
             <w:r>
               <w:rPr>
                 <w:b/>
                 <w:bCs/>
               </w:rPr>
-              <w:t xml:space="preserve">Cause and fix</w:t>
+              <w:t>Cause and fix</w:t>
             </w:r>
           </w:p>
         </w:tc>
@@ -3938,11 +3775,8 @@
             </w:tcMar>
           </w:tcPr>
           <w:p>
-            <w:pPr>
-              <w:spacing w:after="0"/>
-            </w:pPr>
-            <w:r>
-              <w:t xml:space="preserve">"Exceeded licensed limit" when assigning a role</w:t>
+            <w:r>
+              <w:t>"Exceeded licensed limit" when assigning a role</w:t>
             </w:r>
           </w:p>
         </w:tc>
@@ -3957,11 +3791,8 @@
             </w:tcMar>
           </w:tcPr>
           <w:p>
-            <w:pPr>
-              <w:spacing w:after="0"/>
-            </w:pPr>
-            <w:r>
-              <w:t xml:space="preserve">You have assigned more Expert-tier seats than your licence allows. Free a seat, or use a Business-tier role where it is sufficient</w:t>
+            <w:r>
+              <w:t>You have assigned more Expert-tier seats than your licence allows. Free a seat, or use a Business-tier role where it is sufficient</w:t>
             </w:r>
           </w:p>
         </w:tc>
@@ -3978,11 +3809,8 @@
             </w:tcMar>
           </w:tcPr>
           <w:p>
-            <w:pPr>
-              <w:spacing w:after="0"/>
-            </w:pPr>
-            <w:r>
-              <w:t xml:space="preserve">Cannot assign an overlapping role</w:t>
+            <w:r>
+              <w:t>Cannot assign an overlapping role</w:t>
             </w:r>
           </w:p>
         </w:tc>
@@ -3997,11 +3825,8 @@
             </w:tcMar>
           </w:tcPr>
           <w:p>
-            <w:pPr>
-              <w:spacing w:after="0"/>
-            </w:pPr>
-            <w:r>
-              <w:t xml:space="preserve">The PDC UI blocks assigning a default role plus a community derived from the same base role. For catalog.admin's all-roles requirement, assign the roles directly as Keycloak realm roles, which the UI restriction does not govern</w:t>
+            <w:r>
+              <w:t>The PDC UI blocks assigning a default role plus a community derived from the same base role. For catalog.admin's all-roles requirement, assign the roles directly as Keycloak realm roles, which the UI restriction does not govern</w:t>
             </w:r>
           </w:p>
         </w:tc>
@@ -4018,11 +3843,8 @@
             </w:tcMar>
           </w:tcPr>
           <w:p>
-            <w:pPr>
-              <w:spacing w:after="0"/>
-            </w:pPr>
-            <w:r>
-              <w:t xml:space="preserve">A new user cannot sign in</w:t>
+            <w:r>
+              <w:t>A new user cannot sign in</w:t>
             </w:r>
           </w:p>
         </w:tc>
@@ -4037,11 +3859,8 @@
             </w:tcMar>
           </w:tcPr>
           <w:p>
-            <w:pPr>
-              <w:spacing w:after="0"/>
-            </w:pPr>
-            <w:r>
-              <w:t xml:space="preserve">The Keycloak password was left as Temporary, so PDC forces a reset the user cannot complete without email. Reopen Credentials and turn Temporary off, or configure SMTP so the reset link is delivered</w:t>
+            <w:r>
+              <w:t>The Keycloak password was left as Temporary, so PDC forces a reset the user cannot complete without email. Reopen Credentials and turn Temporary off, or configure SMTP so the reset link is delivered</w:t>
             </w:r>
           </w:p>
         </w:tc>
@@ -4058,11 +3877,8 @@
             </w:tcMar>
           </w:tcPr>
           <w:p>
-            <w:pPr>
-              <w:spacing w:after="0"/>
-            </w:pPr>
-            <w:r>
-              <w:t xml:space="preserve">404 or auth error getting a token</w:t>
+            <w:r>
+              <w:t>404 or auth error getting a token</w:t>
             </w:r>
           </w:p>
         </w:tc>
@@ -4077,9 +3893,6 @@
             </w:tcMar>
           </w:tcPr>
           <w:p>
-            <w:pPr>
-              <w:spacing w:after="0"/>
-            </w:pPr>
             <w:r>
               <w:t xml:space="preserve">Wrong realm or base URL. Use the </w:t>
             </w:r>
@@ -4090,7 +3903,7 @@
                 <w:sz w:val="20"/>
                 <w:szCs w:val="20"/>
               </w:rPr>
-              <w:t xml:space="preserve">pdc</w:t>
+              <w:t>pdc</w:t>
             </w:r>
             <w:r>
               <w:t xml:space="preserve"> realm (not </w:t>
@@ -4102,7 +3915,7 @@
                 <w:sz w:val="20"/>
                 <w:szCs w:val="20"/>
               </w:rPr>
-              <w:t xml:space="preserve">master</w:t>
+              <w:t>master</w:t>
             </w:r>
             <w:r>
               <w:t xml:space="preserve">) and the server root as the base — no port suffix and no </w:t>
@@ -4114,7 +3927,7 @@
                 <w:sz w:val="20"/>
                 <w:szCs w:val="20"/>
               </w:rPr>
-              <w:t xml:space="preserve">/keycloak</w:t>
+              <w:t>/keycloak</w:t>
             </w:r>
             <w:r>
               <w:t xml:space="preserve"> in the base URL you configure elsewhere</w:t>
@@ -4134,11 +3947,8 @@
             </w:tcMar>
           </w:tcPr>
           <w:p>
-            <w:pPr>
-              <w:spacing w:after="0"/>
-            </w:pPr>
-            <w:r>
-              <w:t xml:space="preserve">Role change not reflected</w:t>
+            <w:r>
+              <w:t>Role change not reflected</w:t>
             </w:r>
           </w:p>
         </w:tc>
@@ -4153,11 +3963,8 @@
             </w:tcMar>
           </w:tcPr>
           <w:p>
-            <w:pPr>
-              <w:spacing w:after="0"/>
-            </w:pPr>
-            <w:r>
-              <w:t xml:space="preserve">PDC applies permission changes on sign-in. Ask the user to refresh the browser, or sign out and back in</w:t>
+            <w:r>
+              <w:t>PDC applies permission changes on sign-in. Ask the user to refresh the browser, or sign out and back in</w:t>
             </w:r>
           </w:p>
         </w:tc>
@@ -4173,7 +3980,7 @@
         <w:pStyle w:val="Heading1"/>
       </w:pPr>
       <w:r>
-        <w:t xml:space="preserve">Why it matters &amp; discussion</w:t>
+        <w:t>Why it matters &amp; discussion</w:t>
       </w:r>
     </w:p>
     <w:p>
@@ -4188,7 +3995,7 @@
           <w:i/>
           <w:iCs/>
         </w:rPr>
-        <w:t xml:space="preserve">"can I do this?"</w:t>
+        <w:t>"can I do this?"</w:t>
       </w:r>
       <w:r>
         <w:t xml:space="preserve"> but </w:t>
@@ -4198,7 +4005,7 @@
           <w:i/>
           <w:iCs/>
         </w:rPr>
-        <w:t xml:space="preserve">"should this role be able to?"</w:t>
+        <w:t>"should this role be able to?"</w:t>
       </w:r>
     </w:p>
     <w:p>
@@ -4206,7 +4013,7 @@
         <w:pStyle w:val="Heading1"/>
       </w:pPr>
       <w:r>
-        <w:t xml:space="preserve">What's next</w:t>
+        <w:t>What's next</w:t>
       </w:r>
     </w:p>
     <w:p>
@@ -4223,7 +4030,7 @@
           <w:sz w:val="20"/>
           <w:szCs w:val="20"/>
         </w:rPr>
-        <w:t xml:space="preserve">cscu_core</w:t>
+        <w:t>cscu_core</w:t>
       </w:r>
       <w:r>
         <w:t xml:space="preserve"> core banking database and the </w:t>
@@ -4235,7 +4042,7 @@
           <w:sz w:val="20"/>
           <w:szCs w:val="20"/>
         </w:rPr>
-        <w:t xml:space="preserve">cscu-documents</w:t>
+        <w:t>cscu-documents</w:t>
       </w:r>
       <w:r>
         <w:t xml:space="preserve"> object store — performed by </w:t>
@@ -4247,10 +4054,10 @@
           <w:sz w:val="20"/>
           <w:szCs w:val="20"/>
         </w:rPr>
-        <w:t xml:space="preserve">omar.haddad</w:t>
-      </w:r>
-      <w:r>
-        <w:t xml:space="preserve">, whose Data Storage Administrator role exists for exactly that job.</w:t>
+        <w:t>omar.haddad</w:t>
+      </w:r>
+      <w:r>
+        <w:t>, whose Data Storage Administrator role exists for exactly that job.</w:t>
       </w:r>
     </w:p>
     <w:p>
@@ -4258,12 +4065,12 @@
         <w:spacing w:after="120"/>
       </w:pPr>
       <w:r>
-        <w:t xml:space="preserve">All Copper State Credit Union data is fictional and generated for training.</w:t>
+        <w:t>All Copper State Credit Union data is fictional and generated for training.</w:t>
       </w:r>
     </w:p>
     <w:sectPr>
-      <w:headerReference w:type="default" r:id="rId15"/>
-      <w:footerReference w:type="default" r:id="rId16"/>
+      <w:headerReference w:type="default" r:id="rId7"/>
+      <w:footerReference w:type="default" r:id="rId8"/>
       <w:pgSz w:w="12240" w:h="15840"/>
       <w:pgMar w:top="1440" w:right="1440" w:bottom="1440" w:left="1440" w:header="708" w:footer="708" w:gutter="0"/>
       <w:cols w:space="720"/>
@@ -4313,7 +4120,7 @@
         <w:sz w:val="16"/>
         <w:szCs w:val="16"/>
       </w:rPr>
-      <w:t>·</w:t>
+      <w:t>·  Page</w:t>
     </w:r>
     <w:proofErr w:type="gramEnd"/>
     <w:r>
@@ -4322,7 +4129,7 @@
         <w:sz w:val="16"/>
         <w:szCs w:val="16"/>
       </w:rPr>
-      <w:t xml:space="preserve">  Page </w:t>
+      <w:t xml:space="preserve"> </w:t>
     </w:r>
     <w:r>
       <w:rPr>
@@ -5846,19 +5653,19 @@
   <w:num w:numId="6" w16cid:durableId="1962105193">
     <w:abstractNumId w:val="3"/>
   </w:num>
-  <w:num w:numId="100">
+  <w:num w:numId="7" w16cid:durableId="83650977">
     <w:abstractNumId w:val="23"/>
     <w:lvlOverride w:ilvl="0">
       <w:startOverride w:val="1"/>
     </w:lvlOverride>
   </w:num>
-  <w:num w:numId="101">
+  <w:num w:numId="8" w16cid:durableId="1597135317">
     <w:abstractNumId w:val="23"/>
     <w:lvlOverride w:ilvl="0">
       <w:startOverride w:val="1"/>
     </w:lvlOverride>
   </w:num>
-  <w:num w:numId="102">
+  <w:num w:numId="9" w16cid:durableId="927738290">
     <w:abstractNumId w:val="23"/>
     <w:lvlOverride w:ilvl="0">
       <w:startOverride w:val="1"/>

</xml_diff>